<commit_message>
Provision a VFX production project and fix the database upgrade
Install TACTIC's built-in VFX plugin into a new vfx project on first
start (VFX_ENABLED, VFX_PROJECT_CODE, VFX_PROJECT_TITLE), add Ghostscript
and ExifTool for media handling, and give check-ins their own
tactic_assets volume that can point at a host path. The proxy now mounts
only that volume, read-only, so it cannot read the TACTIC config.

Run the schema upgrade with is_confirmed=True. One upgrade step prompts
for input, hit EOFError with no terminal, and aborted every later step,
leaving the database without columns such as schema.project_code, which
made the VFX install fail.

Regenerate the sthpw schema document from a fully upgraded database (73
tables, 776 columns) and correct its notes. Update the architecture
document and README for the VFX project and assets volume.

Co-Authored-By: Claude Sonnet 5.5 <noreply@anthropic.com>
</commit_message>
<xml_diff>
--- a/doc/mlw-TACTIC-docker_Architecture.docx
+++ b/doc/mlw-TACTIC-docker_Architecture.docx
@@ -7,10 +7,6 @@
         <w:pStyle w:val="Title"/>
         <w:rPr/>
       </w:pPr>
-      <w:r>
-        <w:rPr/>
-        <w:t xml:space="preserve">TACTIC Docker </w:t>
-      </w:r>
       <w:r>
         <w:rPr/>
         <w:t>Architecture</w:t>
@@ -80,17 +76,12 @@
             </w:rPr>
             <w:fldChar w:fldCharType="separate"/>
           </w:r>
-          <w:hyperlink w:anchor="__RefHeading___Toc444_3852137598">
+          <w:hyperlink w:anchor="__RefHeading___Toc544_1750870680">
             <w:r>
               <w:rPr>
                 <w:rStyle w:val="IndexLink"/>
               </w:rPr>
               <w:t>Overview</w:t>
-            </w:r>
-            <w:r>
-              <w:rPr>
-                <w:rStyle w:val="IndexLink"/>
-              </w:rPr>
               <w:tab/>
               <w:t>2</w:t>
             </w:r>
@@ -105,7 +96,7 @@
             </w:tabs>
             <w:rPr/>
           </w:pPr>
-          <w:hyperlink w:anchor="__RefHeading___Toc446_3852137598">
+          <w:hyperlink w:anchor="__RefHeading___Toc546_1750870680">
             <w:r>
               <w:rPr>
                 <w:rStyle w:val="IndexLink"/>
@@ -125,7 +116,7 @@
             </w:tabs>
             <w:rPr/>
           </w:pPr>
-          <w:hyperlink w:anchor="__RefHeading___Toc448_3852137598">
+          <w:hyperlink w:anchor="__RefHeading___Toc548_1750870680">
             <w:r>
               <w:rPr>
                 <w:rStyle w:val="IndexLink"/>
@@ -145,7 +136,7 @@
             </w:tabs>
             <w:rPr/>
           </w:pPr>
-          <w:hyperlink w:anchor="__RefHeading___Toc450_3852137598">
+          <w:hyperlink w:anchor="__RefHeading___Toc550_1750870680">
             <w:r>
               <w:rPr>
                 <w:rStyle w:val="IndexLink"/>
@@ -165,7 +156,7 @@
             </w:tabs>
             <w:rPr/>
           </w:pPr>
-          <w:hyperlink w:anchor="__RefHeading___Toc452_3852137598">
+          <w:hyperlink w:anchor="__RefHeading___Toc552_1750870680">
             <w:r>
               <w:rPr>
                 <w:rStyle w:val="IndexLink"/>
@@ -185,7 +176,7 @@
             </w:tabs>
             <w:rPr/>
           </w:pPr>
-          <w:hyperlink w:anchor="__RefHeading___Toc454_3852137598">
+          <w:hyperlink w:anchor="__RefHeading___Toc554_1750870680">
             <w:r>
               <w:rPr>
                 <w:rStyle w:val="IndexLink"/>
@@ -205,7 +196,7 @@
             </w:tabs>
             <w:rPr/>
           </w:pPr>
-          <w:hyperlink w:anchor="__RefHeading___Toc456_3852137598">
+          <w:hyperlink w:anchor="__RefHeading___Toc556_1750870680">
             <w:r>
               <w:rPr>
                 <w:rStyle w:val="IndexLink"/>
@@ -225,7 +216,7 @@
             </w:tabs>
             <w:rPr/>
           </w:pPr>
-          <w:hyperlink w:anchor="__RefHeading___Toc458_3852137598">
+          <w:hyperlink w:anchor="__RefHeading___Toc558_1750870680">
             <w:r>
               <w:rPr>
                 <w:rStyle w:val="IndexLink"/>
@@ -245,14 +236,14 @@
             </w:tabs>
             <w:rPr/>
           </w:pPr>
-          <w:hyperlink w:anchor="__RefHeading___Toc460_3852137598">
+          <w:hyperlink w:anchor="__RefHeading___Toc560_1750870680">
             <w:r>
               <w:rPr>
                 <w:rStyle w:val="IndexLink"/>
               </w:rPr>
-              <w:t>Database (db)</w:t>
+              <w:t>VFX project</w:t>
               <w:tab/>
-              <w:t>4</w:t>
+              <w:t>5</w:t>
             </w:r>
           </w:hyperlink>
         </w:p>
@@ -265,12 +256,12 @@
             </w:tabs>
             <w:rPr/>
           </w:pPr>
-          <w:hyperlink w:anchor="__RefHeading___Toc462_3852137598">
+          <w:hyperlink w:anchor="__RefHeading___Toc562_1750870680">
             <w:r>
               <w:rPr>
                 <w:rStyle w:val="IndexLink"/>
               </w:rPr>
-              <w:t>Storage</w:t>
+              <w:t>Database (db)</w:t>
               <w:tab/>
               <w:t>5</w:t>
             </w:r>
@@ -285,12 +276,12 @@
             </w:tabs>
             <w:rPr/>
           </w:pPr>
-          <w:hyperlink w:anchor="__RefHeading___Toc464_3852137598">
+          <w:hyperlink w:anchor="__RefHeading___Toc564_1750870680">
             <w:r>
               <w:rPr>
                 <w:rStyle w:val="IndexLink"/>
               </w:rPr>
-              <w:t>Configuration</w:t>
+              <w:t>Storage</w:t>
               <w:tab/>
               <w:t>5</w:t>
             </w:r>
@@ -305,14 +296,14 @@
             </w:tabs>
             <w:rPr/>
           </w:pPr>
-          <w:hyperlink w:anchor="__RefHeading___Toc466_3852137598">
+          <w:hyperlink w:anchor="__RefHeading___Toc566_1750870680">
             <w:r>
               <w:rPr>
                 <w:rStyle w:val="IndexLink"/>
               </w:rPr>
-              <w:t>Security and hardening</w:t>
+              <w:t>Configuration</w:t>
               <w:tab/>
-              <w:t>5</w:t>
+              <w:t>6</w:t>
             </w:r>
           </w:hyperlink>
         </w:p>
@@ -325,14 +316,14 @@
             </w:tabs>
             <w:rPr/>
           </w:pPr>
-          <w:hyperlink w:anchor="__RefHeading___Toc468_3852137598">
+          <w:hyperlink w:anchor="__RefHeading___Toc568_1750870680">
             <w:r>
               <w:rPr>
                 <w:rStyle w:val="IndexLink"/>
               </w:rPr>
-              <w:t>Operations</w:t>
+              <w:t>Security and hardening</w:t>
               <w:tab/>
-              <w:t>5</w:t>
+              <w:t>6</w:t>
             </w:r>
           </w:hyperlink>
         </w:p>
@@ -345,14 +336,34 @@
             </w:tabs>
             <w:rPr/>
           </w:pPr>
-          <w:hyperlink w:anchor="__RefHeading___Toc470_3852137598">
+          <w:hyperlink w:anchor="__RefHeading___Toc570_1750870680">
+            <w:r>
+              <w:rPr>
+                <w:rStyle w:val="IndexLink"/>
+              </w:rPr>
+              <w:t>Operations</w:t>
+              <w:tab/>
+              <w:t>7</w:t>
+            </w:r>
+          </w:hyperlink>
+        </w:p>
+        <w:p>
+          <w:pPr>
+            <w:pStyle w:val="TOC2"/>
+            <w:tabs>
+              <w:tab w:val="clear" w:pos="9077"/>
+              <w:tab w:val="right" w:pos="9359" w:leader="dot"/>
+            </w:tabs>
+            <w:rPr/>
+          </w:pPr>
+          <w:hyperlink w:anchor="__RefHeading___Toc572_1750870680">
             <w:r>
               <w:rPr>
                 <w:rStyle w:val="IndexLink"/>
               </w:rPr>
               <w:t>Known limitations</w:t>
               <w:tab/>
-              <w:t>6</w:t>
+              <w:t>7</w:t>
             </w:r>
           </w:hyperlink>
           <w:r>
@@ -395,7 +406,7 @@
         <w:spacing w:before="0" w:after="160"/>
         <w:rPr/>
       </w:pPr>
-      <w:bookmarkStart w:id="0" w:name="__RefHeading___Toc444_3852137598"/>
+      <w:bookmarkStart w:id="0" w:name="__RefHeading___Toc544_1750870680"/>
       <w:bookmarkEnd w:id="0"/>
       <w:r>
         <w:rPr/>
@@ -410,7 +421,7 @@
       </w:pPr>
       <w:r>
         <w:rPr/>
-        <w:t>The deployment is three containers on a private compose network. Only the proxy publishes ports to the host.</w:t>
+        <w:t>The deployment is three containers on a private compose network. Only the proxy publishes ports to the host. It is set up for VFX production: on first start the app creates a VFX project from TACTIC's built-in VFX plugin, alongside TACTIC's own system database.</w:t>
       </w:r>
     </w:p>
     <w:p>
@@ -425,7 +436,7 @@
         <w:rPr/>
         <w:drawing>
           <wp:inline distT="0" distB="0" distL="0" distR="0">
-            <wp:extent cx="4480560" cy="5111115"/>
+            <wp:extent cx="4937760" cy="4003040"/>
             <wp:effectExtent l="0" t="0" r="0" b="0"/>
             <wp:docPr id="1" name="architecture" descr="Architecture diagram&#10;Client, nginx proxy, three TACTIC workers, PostgreSQL and volumes"/>
             <wp:cNvGraphicFramePr>
@@ -449,7 +460,7 @@
                   <pic:spPr bwMode="auto">
                     <a:xfrm>
                       <a:off x="0" y="0"/>
-                      <a:ext cx="4480560" cy="5111115"/>
+                      <a:ext cx="4937760" cy="4003040"/>
                     </a:xfrm>
                     <a:prstGeom prst="rect">
                       <a:avLst/>
@@ -493,8 +504,8 @@
         </w:tblCellMar>
       </w:tblPr>
       <w:tblGrid>
-        <w:gridCol w:w="1888"/>
-        <w:gridCol w:w="2932"/>
+        <w:gridCol w:w="1889"/>
+        <w:gridCol w:w="2931"/>
         <w:gridCol w:w="4540"/>
       </w:tblGrid>
       <w:tr>
@@ -504,7 +515,7 @@
         </w:trPr>
         <w:tc>
           <w:tcPr>
-            <w:tcW w:w="1888" w:type="dxa"/>
+            <w:tcW w:w="1889" w:type="dxa"/>
             <w:tcBorders>
               <w:top w:val="single" w:sz="4" w:space="0" w:color="BFBFBF"/>
               <w:left w:val="single" w:sz="4" w:space="0" w:color="BFBFBF"/>
@@ -531,7 +542,7 @@
         </w:tc>
         <w:tc>
           <w:tcPr>
-            <w:tcW w:w="2932" w:type="dxa"/>
+            <w:tcW w:w="2931" w:type="dxa"/>
             <w:tcBorders>
               <w:top w:val="single" w:sz="4" w:space="0" w:color="BFBFBF"/>
               <w:left w:val="single" w:sz="4" w:space="0" w:color="BFBFBF"/>
@@ -590,7 +601,7 @@
         </w:trPr>
         <w:tc>
           <w:tcPr>
-            <w:tcW w:w="1888" w:type="dxa"/>
+            <w:tcW w:w="1889" w:type="dxa"/>
             <w:tcBorders>
               <w:top w:val="single" w:sz="4" w:space="0" w:color="BFBFBF"/>
               <w:left w:val="single" w:sz="4" w:space="0" w:color="BFBFBF"/>
@@ -614,7 +625,7 @@
         </w:tc>
         <w:tc>
           <w:tcPr>
-            <w:tcW w:w="2932" w:type="dxa"/>
+            <w:tcW w:w="2931" w:type="dxa"/>
             <w:tcBorders>
               <w:top w:val="single" w:sz="4" w:space="0" w:color="BFBFBF"/>
               <w:left w:val="single" w:sz="4" w:space="0" w:color="BFBFBF"/>
@@ -658,7 +669,7 @@
                 <w:sz w:val="20"/>
                 <w:szCs w:val="20"/>
               </w:rPr>
-              <w:t>Terminates TLS, serves static files, balances requests across the TACTIC workers</w:t>
+              <w:t>Terminates TLS, serves static files and media, balances requests across the TACTIC workers</w:t>
             </w:r>
           </w:p>
         </w:tc>
@@ -669,7 +680,7 @@
         </w:trPr>
         <w:tc>
           <w:tcPr>
-            <w:tcW w:w="1888" w:type="dxa"/>
+            <w:tcW w:w="1889" w:type="dxa"/>
             <w:tcBorders>
               <w:top w:val="single" w:sz="4" w:space="0" w:color="BFBFBF"/>
               <w:left w:val="single" w:sz="4" w:space="0" w:color="BFBFBF"/>
@@ -693,7 +704,7 @@
         </w:tc>
         <w:tc>
           <w:tcPr>
-            <w:tcW w:w="2932" w:type="dxa"/>
+            <w:tcW w:w="2931" w:type="dxa"/>
             <w:tcBorders>
               <w:top w:val="single" w:sz="4" w:space="0" w:color="BFBFBF"/>
               <w:left w:val="single" w:sz="4" w:space="0" w:color="BFBFBF"/>
@@ -760,7 +771,7 @@
                 <w:sz w:val="20"/>
                 <w:szCs w:val="20"/>
               </w:rPr>
-              <w:t>, which supervises three CherryPy worker processes</w:t>
+              <w:t>, which supervises three CherryPy worker processes, and does the first-start setup</w:t>
             </w:r>
           </w:p>
         </w:tc>
@@ -771,7 +782,7 @@
         </w:trPr>
         <w:tc>
           <w:tcPr>
-            <w:tcW w:w="1888" w:type="dxa"/>
+            <w:tcW w:w="1889" w:type="dxa"/>
             <w:tcBorders>
               <w:top w:val="single" w:sz="4" w:space="0" w:color="BFBFBF"/>
               <w:left w:val="single" w:sz="4" w:space="0" w:color="BFBFBF"/>
@@ -795,7 +806,7 @@
         </w:tc>
         <w:tc>
           <w:tcPr>
-            <w:tcW w:w="2932" w:type="dxa"/>
+            <w:tcW w:w="2931" w:type="dxa"/>
             <w:tcBorders>
               <w:top w:val="single" w:sz="4" w:space="0" w:color="BFBFBF"/>
               <w:left w:val="single" w:sz="4" w:space="0" w:color="BFBFBF"/>
@@ -839,7 +850,7 @@
                 <w:sz w:val="20"/>
                 <w:szCs w:val="20"/>
               </w:rPr>
-              <w:t xml:space="preserve">Stores the </w:t>
+              <w:t xml:space="preserve">Stores two databases: </w:t>
             </w:r>
             <w:r>
               <w:rPr>
@@ -855,7 +866,23 @@
                 <w:sz w:val="20"/>
                 <w:szCs w:val="20"/>
               </w:rPr>
-              <w:t xml:space="preserve"> database and all project data</w:t>
+              <w:t xml:space="preserve"> (the TACTIC system database) and </w:t>
+            </w:r>
+            <w:r>
+              <w:rPr>
+                <w:rFonts w:eastAsia="Consolas" w:cs="Consolas" w:ascii="Consolas" w:hAnsi="Consolas"/>
+                <w:sz w:val="20"/>
+                <w:szCs w:val="20"/>
+                <w:shd w:fill="F2F2F2" w:val="clear"/>
+              </w:rPr>
+              <w:t>vfx</w:t>
+            </w:r>
+            <w:r>
+              <w:rPr>
+                <w:sz w:val="20"/>
+                <w:szCs w:val="20"/>
+              </w:rPr>
+              <w:t xml:space="preserve"> (the VFX project)</w:t>
             </w:r>
           </w:p>
         </w:tc>
@@ -877,10 +904,9 @@
     <w:p>
       <w:pPr>
         <w:pStyle w:val="Heading1"/>
-        <w:spacing w:before="0" w:after="160"/>
-        <w:rPr/>
-      </w:pPr>
-      <w:bookmarkStart w:id="1" w:name="__RefHeading___Toc446_3852137598"/>
+        <w:rPr/>
+      </w:pPr>
+      <w:bookmarkStart w:id="1" w:name="__RefHeading___Toc546_1750870680"/>
       <w:bookmarkEnd w:id="1"/>
       <w:r>
         <w:rPr/>
@@ -892,7 +918,7 @@
         <w:pStyle w:val="Heading2"/>
         <w:rPr/>
       </w:pPr>
-      <w:bookmarkStart w:id="2" w:name="__RefHeading___Toc448_3852137598"/>
+      <w:bookmarkStart w:id="2" w:name="__RefHeading___Toc548_1750870680"/>
       <w:bookmarkEnd w:id="2"/>
       <w:r>
         <w:rPr/>
@@ -904,7 +930,7 @@
         <w:pStyle w:val="ListParagraph"/>
         <w:numPr>
           <w:ilvl w:val="0"/>
-          <w:numId w:val="8"/>
+          <w:numId w:val="5"/>
         </w:numPr>
         <w:spacing w:before="0" w:after="60"/>
         <w:rPr/>
@@ -919,7 +945,7 @@
         <w:pStyle w:val="ListParagraph"/>
         <w:numPr>
           <w:ilvl w:val="0"/>
-          <w:numId w:val="9"/>
+          <w:numId w:val="1"/>
         </w:numPr>
         <w:spacing w:before="0" w:after="60"/>
         <w:rPr/>
@@ -961,7 +987,7 @@
           <w:szCs w:val="20"/>
           <w:shd w:fill="F2F2F2" w:val="clear"/>
         </w:rPr>
-        <w:t>tactic_data</w:t>
+        <w:t>tactic_assets</w:t>
       </w:r>
       <w:r>
         <w:rPr/>
@@ -978,7 +1004,7 @@
       </w:r>
       <w:r>
         <w:rPr/>
-        <w:t xml:space="preserve"> baked into the proxy image. These never reach Python.</w:t>
+        <w:t xml:space="preserve"> baked into the proxy image. These never reach Python. nginx serves byte ranges, which video review needs. The proxy mounts no other data volume, so it cannot see TACTIC's configuration or the database password.</w:t>
       </w:r>
     </w:p>
     <w:p>
@@ -986,7 +1012,7 @@
         <w:pStyle w:val="ListParagraph"/>
         <w:numPr>
           <w:ilvl w:val="0"/>
-          <w:numId w:val="10"/>
+          <w:numId w:val="1"/>
         </w:numPr>
         <w:spacing w:before="0" w:after="60"/>
         <w:rPr/>
@@ -1105,7 +1131,7 @@
         <w:pStyle w:val="ListParagraph"/>
         <w:numPr>
           <w:ilvl w:val="0"/>
-          <w:numId w:val="11"/>
+          <w:numId w:val="1"/>
         </w:numPr>
         <w:spacing w:before="0" w:after="60"/>
         <w:rPr/>
@@ -1133,7 +1159,7 @@
         <w:pStyle w:val="ListParagraph"/>
         <w:numPr>
           <w:ilvl w:val="0"/>
-          <w:numId w:val="12"/>
+          <w:numId w:val="1"/>
         </w:numPr>
         <w:spacing w:before="0" w:after="60"/>
         <w:rPr/>
@@ -1153,7 +1179,7 @@
       </w:r>
       <w:r>
         <w:rPr/>
-        <w:t>.</w:t>
+        <w:t>. The system database and each project's database are separate databases on the same server.</w:t>
       </w:r>
     </w:p>
     <w:p>
@@ -1161,7 +1187,7 @@
         <w:pStyle w:val="Heading2"/>
         <w:rPr/>
       </w:pPr>
-      <w:bookmarkStart w:id="3" w:name="__RefHeading___Toc450_3852137598"/>
+      <w:bookmarkStart w:id="3" w:name="__RefHeading___Toc550_1750870680"/>
       <w:bookmarkEnd w:id="3"/>
       <w:r>
         <w:rPr/>
@@ -1680,7 +1706,7 @@
         <w:pStyle w:val="Heading2"/>
         <w:rPr/>
       </w:pPr>
-      <w:bookmarkStart w:id="4" w:name="__RefHeading___Toc452_3852137598"/>
+      <w:bookmarkStart w:id="4" w:name="__RefHeading___Toc552_1750870680"/>
       <w:bookmarkEnd w:id="4"/>
       <w:r>
         <w:rPr/>
@@ -1692,7 +1718,7 @@
         <w:pStyle w:val="Heading3"/>
         <w:rPr/>
       </w:pPr>
-      <w:bookmarkStart w:id="5" w:name="__RefHeading___Toc454_3852137598"/>
+      <w:bookmarkStart w:id="5" w:name="__RefHeading___Toc554_1750870680"/>
       <w:bookmarkEnd w:id="5"/>
       <w:r>
         <w:rPr/>
@@ -1728,7 +1754,7 @@
         <w:pStyle w:val="ListParagraph"/>
         <w:numPr>
           <w:ilvl w:val="0"/>
-          <w:numId w:val="13"/>
+          <w:numId w:val="6"/>
         </w:numPr>
         <w:spacing w:before="0" w:after="60"/>
         <w:rPr/>
@@ -1854,7 +1880,7 @@
         <w:pStyle w:val="ListParagraph"/>
         <w:numPr>
           <w:ilvl w:val="0"/>
-          <w:numId w:val="14"/>
+          <w:numId w:val="2"/>
         </w:numPr>
         <w:spacing w:before="0" w:after="60"/>
         <w:rPr/>
@@ -1894,7 +1920,7 @@
       </w:r>
       <w:r>
         <w:rPr/>
-        <w:t xml:space="preserve">, </w:t>
+        <w:t xml:space="preserve"> and </w:t>
       </w:r>
       <w:r>
         <w:rPr>
@@ -1920,7 +1946,7 @@
       </w:r>
       <w:r>
         <w:rPr/>
-        <w:t>), ImageMagick and ffmpeg.</w:t>
+        <w:t>), plus the media tools TACTIC runs: ImageMagick, FFmpeg and ffprobe, Ghostscript and ExifTool.</w:t>
       </w:r>
     </w:p>
     <w:p>
@@ -1928,7 +1954,7 @@
         <w:pStyle w:val="ListParagraph"/>
         <w:numPr>
           <w:ilvl w:val="0"/>
-          <w:numId w:val="15"/>
+          <w:numId w:val="2"/>
         </w:numPr>
         <w:spacing w:before="0" w:after="60"/>
         <w:rPr/>
@@ -2022,7 +2048,7 @@
         <w:pStyle w:val="Heading3"/>
         <w:rPr/>
       </w:pPr>
-      <w:bookmarkStart w:id="6" w:name="__RefHeading___Toc456_3852137598"/>
+      <w:bookmarkStart w:id="6" w:name="__RefHeading___Toc556_1750870680"/>
       <w:bookmarkEnd w:id="6"/>
       <w:r>
         <w:rPr/>
@@ -2050,7 +2076,7 @@
       </w:r>
       <w:r>
         <w:rPr/>
-        <w:t xml:space="preserve"> user, with </w:t>
+        <w:t xml:space="preserve"> user (uid 1000), with </w:t>
       </w:r>
       <w:r>
         <w:rPr>
@@ -2212,7 +2238,7 @@
         <w:pStyle w:val="Heading3"/>
         <w:rPr/>
       </w:pPr>
-      <w:bookmarkStart w:id="7" w:name="__RefHeading___Toc458_3852137598"/>
+      <w:bookmarkStart w:id="7" w:name="__RefHeading___Toc558_1750870680"/>
       <w:bookmarkEnd w:id="7"/>
       <w:r>
         <w:rPr/>
@@ -2244,7 +2270,7 @@
         <w:pStyle w:val="ListParagraph"/>
         <w:numPr>
           <w:ilvl w:val="0"/>
-          <w:numId w:val="16"/>
+          <w:numId w:val="7"/>
         </w:numPr>
         <w:spacing w:before="0" w:after="60"/>
         <w:rPr/>
@@ -2277,6 +2303,19 @@
       </w:r>
       <w:r>
         <w:rPr/>
+        <w:t xml:space="preserve">, </w:t>
+      </w:r>
+      <w:r>
+        <w:rPr>
+          <w:rFonts w:eastAsia="Consolas" w:cs="Consolas" w:ascii="Consolas" w:hAnsi="Consolas"/>
+          <w:sz w:val="20"/>
+          <w:szCs w:val="20"/>
+          <w:shd w:fill="F2F2F2" w:val="clear"/>
+        </w:rPr>
+        <w:t>TACTIC_PROTOCOL</w:t>
+      </w:r>
+      <w:r>
+        <w:rPr/>
         <w:t xml:space="preserve"> and </w:t>
       </w:r>
       <w:r>
@@ -2286,7 +2325,7 @@
           <w:szCs w:val="20"/>
           <w:shd w:fill="F2F2F2" w:val="clear"/>
         </w:rPr>
-        <w:t>TACTIC_PROTOCOL</w:t>
+        <w:t>VFX_*</w:t>
       </w:r>
       <w:r>
         <w:rPr/>
@@ -2298,7 +2337,7 @@
         <w:pStyle w:val="ListParagraph"/>
         <w:numPr>
           <w:ilvl w:val="0"/>
-          <w:numId w:val="17"/>
+          <w:numId w:val="3"/>
         </w:numPr>
         <w:spacing w:before="0" w:after="60"/>
         <w:rPr/>
@@ -2326,7 +2365,7 @@
         <w:pStyle w:val="ListParagraph"/>
         <w:numPr>
           <w:ilvl w:val="0"/>
-          <w:numId w:val="18"/>
+          <w:numId w:val="3"/>
         </w:numPr>
         <w:spacing w:before="0" w:after="60"/>
         <w:rPr/>
@@ -2404,7 +2443,7 @@
         <w:pStyle w:val="ListParagraph"/>
         <w:numPr>
           <w:ilvl w:val="0"/>
-          <w:numId w:val="19"/>
+          <w:numId w:val="3"/>
         </w:numPr>
         <w:spacing w:before="0" w:after="60"/>
         <w:rPr/>
@@ -2432,7 +2471,7 @@
         <w:pStyle w:val="ListParagraph"/>
         <w:numPr>
           <w:ilvl w:val="0"/>
-          <w:numId w:val="20"/>
+          <w:numId w:val="3"/>
         </w:numPr>
         <w:spacing w:before="0" w:after="60"/>
         <w:rPr/>
@@ -2478,7 +2517,7 @@
       </w:r>
       <w:r>
         <w:rPr/>
-        <w:t xml:space="preserve"> user and group and the default notifications, and runs the schema upgrade for the installed version.</w:t>
+        <w:t xml:space="preserve"> user and group and the default notifications, and runs TACTIC's schema upgrade steps.</w:t>
       </w:r>
     </w:p>
     <w:p>
@@ -2486,13 +2525,67 @@
         <w:pStyle w:val="ListParagraph"/>
         <w:numPr>
           <w:ilvl w:val="0"/>
-          <w:numId w:val="21"/>
+          <w:numId w:val="3"/>
         </w:numPr>
         <w:spacing w:before="0" w:after="60"/>
         <w:rPr/>
       </w:pPr>
       <w:r>
         <w:rPr/>
+        <w:t xml:space="preserve">Runs </w:t>
+      </w:r>
+      <w:r>
+        <w:rPr>
+          <w:rFonts w:eastAsia="Consolas" w:cs="Consolas" w:ascii="Consolas" w:hAnsi="Consolas"/>
+          <w:sz w:val="20"/>
+          <w:szCs w:val="20"/>
+          <w:shd w:fill="F2F2F2" w:val="clear"/>
+        </w:rPr>
+        <w:t>docker/bootstrap_vfx.py</w:t>
+      </w:r>
+      <w:r>
+        <w:rPr/>
+        <w:t xml:space="preserve"> when </w:t>
+      </w:r>
+      <w:r>
+        <w:rPr>
+          <w:rFonts w:eastAsia="Consolas" w:cs="Consolas" w:ascii="Consolas" w:hAnsi="Consolas"/>
+          <w:sz w:val="20"/>
+          <w:szCs w:val="20"/>
+          <w:shd w:fill="F2F2F2" w:val="clear"/>
+        </w:rPr>
+        <w:t>VFX_ENABLED</w:t>
+      </w:r>
+      <w:r>
+        <w:rPr/>
+        <w:t xml:space="preserve"> is </w:t>
+      </w:r>
+      <w:r>
+        <w:rPr>
+          <w:rFonts w:eastAsia="Consolas" w:cs="Consolas" w:ascii="Consolas" w:hAnsi="Consolas"/>
+          <w:sz w:val="20"/>
+          <w:szCs w:val="20"/>
+          <w:shd w:fill="F2F2F2" w:val="clear"/>
+        </w:rPr>
+        <w:t>true</w:t>
+      </w:r>
+      <w:r>
+        <w:rPr/>
+        <w:t xml:space="preserve"> (the default). See the next section.</w:t>
+      </w:r>
+    </w:p>
+    <w:p>
+      <w:pPr>
+        <w:pStyle w:val="ListParagraph"/>
+        <w:numPr>
+          <w:ilvl w:val="0"/>
+          <w:numId w:val="3"/>
+        </w:numPr>
+        <w:spacing w:before="0" w:after="60"/>
+        <w:rPr/>
+      </w:pPr>
+      <w:r>
+        <w:rPr/>
         <w:t>Replaces itself with the command (</w:t>
       </w:r>
       <w:r>
@@ -2507,18 +2600,6 @@
       <w:r>
         <w:rPr/>
         <w:t>).</w:t>
-      </w:r>
-    </w:p>
-    <w:p>
-      <w:pPr>
-        <w:pStyle w:val="Heading2"/>
-        <w:rPr/>
-      </w:pPr>
-      <w:bookmarkStart w:id="8" w:name="__RefHeading___Toc460_3852137598"/>
-      <w:bookmarkEnd w:id="8"/>
-      <w:r>
-        <w:rPr/>
-        <w:t>Database (db)</w:t>
       </w:r>
     </w:p>
     <w:p>
@@ -2529,6 +2610,338 @@
       </w:pPr>
       <w:r>
         <w:rPr/>
+        <w:t xml:space="preserve">The upgrade in step 5 runs with </w:t>
+      </w:r>
+      <w:r>
+        <w:rPr>
+          <w:rFonts w:eastAsia="Consolas" w:cs="Consolas" w:ascii="Consolas" w:hAnsi="Consolas"/>
+          <w:sz w:val="20"/>
+          <w:szCs w:val="20"/>
+          <w:shd w:fill="F2F2F2" w:val="clear"/>
+        </w:rPr>
+        <w:t>is_confirmed=True</w:t>
+      </w:r>
+      <w:r>
+        <w:rPr/>
+        <w:t xml:space="preserve">. One upgrade step otherwise asks "Run now? (y/n)"; with no terminal it fails with </w:t>
+      </w:r>
+      <w:r>
+        <w:rPr>
+          <w:rFonts w:eastAsia="Consolas" w:cs="Consolas" w:ascii="Consolas" w:hAnsi="Consolas"/>
+          <w:sz w:val="20"/>
+          <w:szCs w:val="20"/>
+          <w:shd w:fill="F2F2F2" w:val="clear"/>
+        </w:rPr>
+        <w:t>EOFError</w:t>
+      </w:r>
+      <w:r>
+        <w:rPr/>
+        <w:t>, which stops every later upgrade step and leaves the database missing columns that the VFX installer needs.</w:t>
+      </w:r>
+    </w:p>
+    <w:p>
+      <w:pPr>
+        <w:pStyle w:val="Heading2"/>
+        <w:rPr/>
+      </w:pPr>
+      <w:bookmarkStart w:id="8" w:name="__RefHeading___Toc560_1750870680"/>
+      <w:bookmarkEnd w:id="8"/>
+      <w:r>
+        <w:rPr/>
+        <w:t>VFX project</w:t>
+      </w:r>
+    </w:p>
+    <w:p>
+      <w:pPr>
+        <w:pStyle w:val="Normal"/>
+        <w:spacing w:before="0" w:after="120"/>
+        <w:rPr/>
+      </w:pPr>
+      <w:r>
+        <w:rPr>
+          <w:rFonts w:eastAsia="Consolas" w:cs="Consolas" w:ascii="Consolas" w:hAnsi="Consolas"/>
+          <w:sz w:val="20"/>
+          <w:szCs w:val="20"/>
+          <w:shd w:fill="F2F2F2" w:val="clear"/>
+        </w:rPr>
+        <w:t>docker/bootstrap_vfx.py</w:t>
+      </w:r>
+      <w:r>
+        <w:rPr/>
+        <w:t xml:space="preserve"> does what the Create Project dialog does when "VFX (built in)" is chosen. It runs TACTIC's </w:t>
+      </w:r>
+      <w:r>
+        <w:rPr>
+          <w:rFonts w:eastAsia="Consolas" w:cs="Consolas" w:ascii="Consolas" w:hAnsi="Consolas"/>
+          <w:sz w:val="20"/>
+          <w:szCs w:val="20"/>
+          <w:shd w:fill="F2F2F2" w:val="clear"/>
+        </w:rPr>
+        <w:t>ProjectTemplateInstallerCmd</w:t>
+      </w:r>
+      <w:r>
+        <w:rPr/>
+        <w:t xml:space="preserve"> with the plugin directory </w:t>
+      </w:r>
+      <w:r>
+        <w:rPr>
+          <w:rFonts w:eastAsia="Consolas" w:cs="Consolas" w:ascii="Consolas" w:hAnsi="Consolas"/>
+          <w:sz w:val="20"/>
+          <w:szCs w:val="20"/>
+          <w:shd w:fill="F2F2F2" w:val="clear"/>
+        </w:rPr>
+        <w:t>src/plugins/TACTIC/vfx</w:t>
+      </w:r>
+      <w:r>
+        <w:rPr/>
+        <w:t>. The installer:</w:t>
+      </w:r>
+    </w:p>
+    <w:p>
+      <w:pPr>
+        <w:pStyle w:val="ListParagraph"/>
+        <w:numPr>
+          <w:ilvl w:val="0"/>
+          <w:numId w:val="2"/>
+        </w:numPr>
+        <w:spacing w:before="0" w:after="60"/>
+        <w:rPr/>
+      </w:pPr>
+      <w:r>
+        <w:rPr/>
+        <w:t xml:space="preserve">creates a project (default code </w:t>
+      </w:r>
+      <w:r>
+        <w:rPr>
+          <w:rFonts w:eastAsia="Consolas" w:cs="Consolas" w:ascii="Consolas" w:hAnsi="Consolas"/>
+          <w:sz w:val="20"/>
+          <w:szCs w:val="20"/>
+          <w:shd w:fill="F2F2F2" w:val="clear"/>
+        </w:rPr>
+        <w:t>vfx</w:t>
+      </w:r>
+      <w:r>
+        <w:rPr/>
+        <w:t>) and a PostgreSQL database of the same name;</w:t>
+      </w:r>
+    </w:p>
+    <w:p>
+      <w:pPr>
+        <w:pStyle w:val="ListParagraph"/>
+        <w:numPr>
+          <w:ilvl w:val="0"/>
+          <w:numId w:val="2"/>
+        </w:numPr>
+        <w:spacing w:before="0" w:after="60"/>
+        <w:rPr/>
+      </w:pPr>
+      <w:r>
+        <w:rPr/>
+        <w:t xml:space="preserve">registers the VFX search types, 23 in the </w:t>
+      </w:r>
+      <w:r>
+        <w:rPr>
+          <w:rFonts w:eastAsia="Consolas" w:cs="Consolas" w:ascii="Consolas" w:hAnsi="Consolas"/>
+          <w:sz w:val="20"/>
+          <w:szCs w:val="20"/>
+          <w:shd w:fill="F2F2F2" w:val="clear"/>
+        </w:rPr>
+        <w:t>vfx/</w:t>
+      </w:r>
+      <w:r>
+        <w:rPr/>
+        <w:t xml:space="preserve"> namespace, such as </w:t>
+      </w:r>
+      <w:r>
+        <w:rPr>
+          <w:rFonts w:eastAsia="Consolas" w:cs="Consolas" w:ascii="Consolas" w:hAnsi="Consolas"/>
+          <w:sz w:val="20"/>
+          <w:szCs w:val="20"/>
+          <w:shd w:fill="F2F2F2" w:val="clear"/>
+        </w:rPr>
+        <w:t>vfx/shot</w:t>
+      </w:r>
+      <w:r>
+        <w:rPr/>
+        <w:t xml:space="preserve">, </w:t>
+      </w:r>
+      <w:r>
+        <w:rPr>
+          <w:rFonts w:eastAsia="Consolas" w:cs="Consolas" w:ascii="Consolas" w:hAnsi="Consolas"/>
+          <w:sz w:val="20"/>
+          <w:szCs w:val="20"/>
+          <w:shd w:fill="F2F2F2" w:val="clear"/>
+        </w:rPr>
+        <w:t>vfx/asset</w:t>
+      </w:r>
+      <w:r>
+        <w:rPr/>
+        <w:t xml:space="preserve">, </w:t>
+      </w:r>
+      <w:r>
+        <w:rPr>
+          <w:rFonts w:eastAsia="Consolas" w:cs="Consolas" w:ascii="Consolas" w:hAnsi="Consolas"/>
+          <w:sz w:val="20"/>
+          <w:szCs w:val="20"/>
+          <w:shd w:fill="F2F2F2" w:val="clear"/>
+        </w:rPr>
+        <w:t>vfx/sequence</w:t>
+      </w:r>
+      <w:r>
+        <w:rPr/>
+        <w:t xml:space="preserve">, </w:t>
+      </w:r>
+      <w:r>
+        <w:rPr>
+          <w:rFonts w:eastAsia="Consolas" w:cs="Consolas" w:ascii="Consolas" w:hAnsi="Consolas"/>
+          <w:sz w:val="20"/>
+          <w:szCs w:val="20"/>
+          <w:shd w:fill="F2F2F2" w:val="clear"/>
+        </w:rPr>
+        <w:t>vfx/plate</w:t>
+      </w:r>
+      <w:r>
+        <w:rPr/>
+        <w:t xml:space="preserve"> and </w:t>
+      </w:r>
+      <w:r>
+        <w:rPr>
+          <w:rFonts w:eastAsia="Consolas" w:cs="Consolas" w:ascii="Consolas" w:hAnsi="Consolas"/>
+          <w:sz w:val="20"/>
+          <w:szCs w:val="20"/>
+          <w:shd w:fill="F2F2F2" w:val="clear"/>
+        </w:rPr>
+        <w:t>vfx/review</w:t>
+      </w:r>
+      <w:r>
+        <w:rPr/>
+        <w:t>, and creates their tables in the project database;</w:t>
+      </w:r>
+    </w:p>
+    <w:p>
+      <w:pPr>
+        <w:pStyle w:val="ListParagraph"/>
+        <w:numPr>
+          <w:ilvl w:val="0"/>
+          <w:numId w:val="2"/>
+        </w:numPr>
+        <w:spacing w:before="0" w:after="60"/>
+        <w:rPr/>
+      </w:pPr>
+      <w:r>
+        <w:rPr/>
+        <w:t>creates the shot and asset pipelines (workflow processes such as Layout, Animation, Effects, Lighting and Compositing);</w:t>
+      </w:r>
+    </w:p>
+    <w:p>
+      <w:pPr>
+        <w:pStyle w:val="ListParagraph"/>
+        <w:numPr>
+          <w:ilvl w:val="0"/>
+          <w:numId w:val="2"/>
+        </w:numPr>
+        <w:spacing w:before="0" w:after="60"/>
+        <w:rPr/>
+      </w:pPr>
+      <w:r>
+        <w:rPr/>
+        <w:t>loads the interface configuration: about 200 widget configurations (views, layouts, the shot planner and side bar), naming rules, triggers, scripts and production settings.</w:t>
+      </w:r>
+    </w:p>
+    <w:p>
+      <w:pPr>
+        <w:pStyle w:val="Normal"/>
+        <w:spacing w:before="0" w:after="120"/>
+        <w:rPr/>
+      </w:pPr>
+      <w:r>
+        <w:rPr/>
+        <w:t xml:space="preserve">If the project already exists the script does nothing, so restarts are safe. </w:t>
+      </w:r>
+      <w:r>
+        <w:rPr>
+          <w:rFonts w:eastAsia="Consolas" w:cs="Consolas" w:ascii="Consolas" w:hAnsi="Consolas"/>
+          <w:sz w:val="20"/>
+          <w:szCs w:val="20"/>
+          <w:shd w:fill="F2F2F2" w:val="clear"/>
+        </w:rPr>
+        <w:t>VFX_PROJECT_CODE</w:t>
+      </w:r>
+      <w:r>
+        <w:rPr/>
+        <w:t xml:space="preserve"> and </w:t>
+      </w:r>
+      <w:r>
+        <w:rPr>
+          <w:rFonts w:eastAsia="Consolas" w:cs="Consolas" w:ascii="Consolas" w:hAnsi="Consolas"/>
+          <w:sz w:val="20"/>
+          <w:szCs w:val="20"/>
+          <w:shd w:fill="F2F2F2" w:val="clear"/>
+        </w:rPr>
+        <w:t>VFX_PROJECT_TITLE</w:t>
+      </w:r>
+      <w:r>
+        <w:rPr/>
+        <w:t xml:space="preserve"> set the code and title; </w:t>
+      </w:r>
+      <w:r>
+        <w:rPr>
+          <w:rFonts w:eastAsia="Consolas" w:cs="Consolas" w:ascii="Consolas" w:hAnsi="Consolas"/>
+          <w:sz w:val="20"/>
+          <w:szCs w:val="20"/>
+          <w:shd w:fill="F2F2F2" w:val="clear"/>
+        </w:rPr>
+        <w:t>VFX_ENABLED=false</w:t>
+      </w:r>
+      <w:r>
+        <w:rPr/>
+        <w:t xml:space="preserve"> skips the step so only the system database is created.</w:t>
+      </w:r>
+    </w:p>
+    <w:p>
+      <w:pPr>
+        <w:pStyle w:val="Normal"/>
+        <w:spacing w:before="0" w:after="120"/>
+        <w:rPr/>
+      </w:pPr>
+      <w:r>
+        <w:rPr/>
+        <w:t xml:space="preserve">Check-ins made in the project are stored in the </w:t>
+      </w:r>
+      <w:r>
+        <w:rPr>
+          <w:rFonts w:eastAsia="Consolas" w:cs="Consolas" w:ascii="Consolas" w:hAnsi="Consolas"/>
+          <w:sz w:val="20"/>
+          <w:szCs w:val="20"/>
+          <w:shd w:fill="F2F2F2" w:val="clear"/>
+        </w:rPr>
+        <w:t>tactic_assets</w:t>
+      </w:r>
+      <w:r>
+        <w:rPr/>
+        <w:t xml:space="preserve"> volume. For each check-in TACTIC keeps the original and makes a web rendition and an icon. DPX, Cineon, TIFF, JPEG 2000, PNG and JPEG are handled by ImageMagick; video and review media use FFmpeg. EXR frames can be stored but get no thumbnail or web rendition, because Debian's ImageMagick is built without OpenEXR.</w:t>
+      </w:r>
+    </w:p>
+    <w:p>
+      <w:pPr>
+        <w:pStyle w:val="Heading2"/>
+        <w:rPr/>
+      </w:pPr>
+      <w:bookmarkStart w:id="9" w:name="__RefHeading___Toc562_1750870680"/>
+      <w:bookmarkEnd w:id="9"/>
+      <w:r>
+        <w:rPr/>
+        <w:t>Database (db)</w:t>
+      </w:r>
+    </w:p>
+    <w:p>
+      <w:pPr>
+        <w:pStyle w:val="Normal"/>
+        <w:spacing w:before="0" w:after="120"/>
+        <w:rPr/>
+      </w:pPr>
+      <w:r>
+        <w:rPr/>
         <w:t xml:space="preserve">Stock </w:t>
       </w:r>
       <w:r>
@@ -2594,7 +3007,33 @@
       </w:r>
       <w:r>
         <w:rPr/>
-        <w:t xml:space="preserve">. It publishes no host port and is reachable only by the </w:t>
+        <w:t xml:space="preserve">. It holds two databases: </w:t>
+      </w:r>
+      <w:r>
+        <w:rPr>
+          <w:rFonts w:eastAsia="Consolas" w:cs="Consolas" w:ascii="Consolas" w:hAnsi="Consolas"/>
+          <w:sz w:val="20"/>
+          <w:szCs w:val="20"/>
+          <w:shd w:fill="F2F2F2" w:val="clear"/>
+        </w:rPr>
+        <w:t>sthpw</w:t>
+      </w:r>
+      <w:r>
+        <w:rPr/>
+        <w:t xml:space="preserve"> (users, groups, the list of projects and search types, pipelines and the history of tasks and transactions; see the sthpw schema document) and one database per project (</w:t>
+      </w:r>
+      <w:r>
+        <w:rPr>
+          <w:rFonts w:eastAsia="Consolas" w:cs="Consolas" w:ascii="Consolas" w:hAnsi="Consolas"/>
+          <w:sz w:val="20"/>
+          <w:szCs w:val="20"/>
+          <w:shd w:fill="F2F2F2" w:val="clear"/>
+        </w:rPr>
+        <w:t>vfx</w:t>
+      </w:r>
+      <w:r>
+        <w:rPr/>
+        <w:t xml:space="preserve">). It publishes no host port and is reachable only by the </w:t>
       </w:r>
       <w:r>
         <w:rPr>
@@ -2641,8 +3080,8 @@
         <w:pStyle w:val="Heading2"/>
         <w:rPr/>
       </w:pPr>
-      <w:bookmarkStart w:id="9" w:name="__RefHeading___Toc462_3852137598"/>
-      <w:bookmarkEnd w:id="9"/>
+      <w:bookmarkStart w:id="10" w:name="__RefHeading___Toc564_1750870680"/>
+      <w:bookmarkEnd w:id="10"/>
       <w:r>
         <w:rPr/>
         <w:t>Storage</w:t>
@@ -2662,8 +3101,8 @@
         </w:tblCellMar>
       </w:tblPr>
       <w:tblGrid>
-        <w:gridCol w:w="1699"/>
-        <w:gridCol w:w="3575"/>
+        <w:gridCol w:w="1700"/>
+        <w:gridCol w:w="3574"/>
         <w:gridCol w:w="4086"/>
       </w:tblGrid>
       <w:tr>
@@ -2673,7 +3112,7 @@
         </w:trPr>
         <w:tc>
           <w:tcPr>
-            <w:tcW w:w="1699" w:type="dxa"/>
+            <w:tcW w:w="1700" w:type="dxa"/>
             <w:tcBorders>
               <w:top w:val="single" w:sz="4" w:space="0" w:color="BFBFBF"/>
               <w:left w:val="single" w:sz="4" w:space="0" w:color="BFBFBF"/>
@@ -2700,7 +3139,7 @@
         </w:tc>
         <w:tc>
           <w:tcPr>
-            <w:tcW w:w="3575" w:type="dxa"/>
+            <w:tcW w:w="3574" w:type="dxa"/>
             <w:tcBorders>
               <w:top w:val="single" w:sz="4" w:space="0" w:color="BFBFBF"/>
               <w:left w:val="single" w:sz="4" w:space="0" w:color="BFBFBF"/>
@@ -2759,7 +3198,7 @@
         </w:trPr>
         <w:tc>
           <w:tcPr>
-            <w:tcW w:w="1699" w:type="dxa"/>
+            <w:tcW w:w="1700" w:type="dxa"/>
             <w:tcBorders>
               <w:top w:val="single" w:sz="4" w:space="0" w:color="BFBFBF"/>
               <w:left w:val="single" w:sz="4" w:space="0" w:color="BFBFBF"/>
@@ -2785,7 +3224,7 @@
         </w:tc>
         <w:tc>
           <w:tcPr>
-            <w:tcW w:w="3575" w:type="dxa"/>
+            <w:tcW w:w="3574" w:type="dxa"/>
             <w:tcBorders>
               <w:top w:val="single" w:sz="4" w:space="0" w:color="BFBFBF"/>
               <w:left w:val="single" w:sz="4" w:space="0" w:color="BFBFBF"/>
@@ -2806,29 +3245,6 @@
                 <w:shd w:fill="F2F2F2" w:val="clear"/>
               </w:rPr>
               <w:t>tactic</w:t>
-            </w:r>
-            <w:r>
-              <w:rPr>
-                <w:sz w:val="20"/>
-                <w:szCs w:val="20"/>
-              </w:rPr>
-              <w:t xml:space="preserve"> (read-write), </w:t>
-            </w:r>
-            <w:r>
-              <w:rPr>
-                <w:rFonts w:eastAsia="Consolas" w:cs="Consolas" w:ascii="Consolas" w:hAnsi="Consolas"/>
-                <w:sz w:val="20"/>
-                <w:szCs w:val="20"/>
-                <w:shd w:fill="F2F2F2" w:val="clear"/>
-              </w:rPr>
-              <w:t>proxy</w:t>
-            </w:r>
-            <w:r>
-              <w:rPr>
-                <w:sz w:val="20"/>
-                <w:szCs w:val="20"/>
-              </w:rPr>
-              <w:t xml:space="preserve"> (read-only)</w:t>
             </w:r>
           </w:p>
         </w:tc>
@@ -2861,7 +3277,7 @@
                 <w:sz w:val="20"/>
                 <w:szCs w:val="20"/>
               </w:rPr>
-              <w:t xml:space="preserve">, </w:t>
+              <w:t xml:space="preserve"> (including </w:t>
             </w:r>
             <w:r>
               <w:rPr>
@@ -2870,14 +3286,14 @@
                 <w:szCs w:val="20"/>
                 <w:shd w:fill="F2F2F2" w:val="clear"/>
               </w:rPr>
-              <w:t>assets/</w:t>
-            </w:r>
-            <w:r>
-              <w:rPr>
-                <w:sz w:val="20"/>
-                <w:szCs w:val="20"/>
-              </w:rPr>
-              <w:t xml:space="preserve"> (check-ins served by nginx), </w:t>
+              <w:t>tactic-conf.xml</w:t>
+            </w:r>
+            <w:r>
+              <w:rPr>
+                <w:sz w:val="20"/>
+                <w:szCs w:val="20"/>
+              </w:rPr>
+              <w:t xml:space="preserve">), </w:t>
             </w:r>
             <w:r>
               <w:rPr>
@@ -2913,7 +3329,7 @@
         </w:trPr>
         <w:tc>
           <w:tcPr>
-            <w:tcW w:w="1699" w:type="dxa"/>
+            <w:tcW w:w="1700" w:type="dxa"/>
             <w:tcBorders>
               <w:top w:val="single" w:sz="4" w:space="0" w:color="BFBFBF"/>
               <w:left w:val="single" w:sz="4" w:space="0" w:color="BFBFBF"/>
@@ -2933,13 +3349,13 @@
                 <w:szCs w:val="20"/>
                 <w:shd w:fill="F2F2F2" w:val="clear"/>
               </w:rPr>
-              <w:t>tactic_temp</w:t>
+              <w:t>tactic_assets</w:t>
             </w:r>
           </w:p>
         </w:tc>
         <w:tc>
           <w:tcPr>
-            <w:tcW w:w="3575" w:type="dxa"/>
+            <w:tcW w:w="3574" w:type="dxa"/>
             <w:tcBorders>
               <w:top w:val="single" w:sz="4" w:space="0" w:color="BFBFBF"/>
               <w:left w:val="single" w:sz="4" w:space="0" w:color="BFBFBF"/>
@@ -2960,6 +3376,29 @@
                 <w:shd w:fill="F2F2F2" w:val="clear"/>
               </w:rPr>
               <w:t>tactic</w:t>
+            </w:r>
+            <w:r>
+              <w:rPr>
+                <w:sz w:val="20"/>
+                <w:szCs w:val="20"/>
+              </w:rPr>
+              <w:t xml:space="preserve"> (read-write), </w:t>
+            </w:r>
+            <w:r>
+              <w:rPr>
+                <w:rFonts w:eastAsia="Consolas" w:cs="Consolas" w:ascii="Consolas" w:hAnsi="Consolas"/>
+                <w:sz w:val="20"/>
+                <w:szCs w:val="20"/>
+                <w:shd w:fill="F2F2F2" w:val="clear"/>
+              </w:rPr>
+              <w:t>proxy</w:t>
+            </w:r>
+            <w:r>
+              <w:rPr>
+                <w:sz w:val="20"/>
+                <w:szCs w:val="20"/>
+              </w:rPr>
+              <w:t xml:space="preserve"> (read-only)</w:t>
             </w:r>
           </w:p>
         </w:tc>
@@ -2983,7 +3422,39 @@
                 <w:sz w:val="20"/>
                 <w:szCs w:val="20"/>
               </w:rPr>
-              <w:t>Upload, download, cache and temp files</w:t>
+              <w:t xml:space="preserve">Checked-in media, mounted at </w:t>
+            </w:r>
+            <w:r>
+              <w:rPr>
+                <w:rFonts w:eastAsia="Consolas" w:cs="Consolas" w:ascii="Consolas" w:hAnsi="Consolas"/>
+                <w:sz w:val="20"/>
+                <w:szCs w:val="20"/>
+                <w:shd w:fill="F2F2F2" w:val="clear"/>
+              </w:rPr>
+              <w:t>tactic_data/assets</w:t>
+            </w:r>
+            <w:r>
+              <w:rPr>
+                <w:sz w:val="20"/>
+                <w:szCs w:val="20"/>
+              </w:rPr>
+              <w:t xml:space="preserve">. Set </w:t>
+            </w:r>
+            <w:r>
+              <w:rPr>
+                <w:rFonts w:eastAsia="Consolas" w:cs="Consolas" w:ascii="Consolas" w:hAnsi="Consolas"/>
+                <w:sz w:val="20"/>
+                <w:szCs w:val="20"/>
+                <w:shd w:fill="F2F2F2" w:val="clear"/>
+              </w:rPr>
+              <w:t>TACTIC_ASSETS</w:t>
+            </w:r>
+            <w:r>
+              <w:rPr>
+                <w:sz w:val="20"/>
+                <w:szCs w:val="20"/>
+              </w:rPr>
+              <w:t xml:space="preserve"> to a host path, such as a NAS mount, to use other storage</w:t>
             </w:r>
           </w:p>
         </w:tc>
@@ -2994,7 +3465,7 @@
         </w:trPr>
         <w:tc>
           <w:tcPr>
-            <w:tcW w:w="1699" w:type="dxa"/>
+            <w:tcW w:w="1700" w:type="dxa"/>
             <w:tcBorders>
               <w:top w:val="single" w:sz="4" w:space="0" w:color="BFBFBF"/>
               <w:left w:val="single" w:sz="4" w:space="0" w:color="BFBFBF"/>
@@ -3014,13 +3485,13 @@
                 <w:szCs w:val="20"/>
                 <w:shd w:fill="F2F2F2" w:val="clear"/>
               </w:rPr>
-              <w:t>tactic_db</w:t>
+              <w:t>tactic_temp</w:t>
             </w:r>
           </w:p>
         </w:tc>
         <w:tc>
           <w:tcPr>
-            <w:tcW w:w="3575" w:type="dxa"/>
+            <w:tcW w:w="3574" w:type="dxa"/>
             <w:tcBorders>
               <w:top w:val="single" w:sz="4" w:space="0" w:color="BFBFBF"/>
               <w:left w:val="single" w:sz="4" w:space="0" w:color="BFBFBF"/>
@@ -3040,7 +3511,7 @@
                 <w:szCs w:val="20"/>
                 <w:shd w:fill="F2F2F2" w:val="clear"/>
               </w:rPr>
-              <w:t>db</w:t>
+              <w:t>tactic</w:t>
             </w:r>
           </w:p>
         </w:tc>
@@ -3064,6 +3535,87 @@
                 <w:sz w:val="20"/>
                 <w:szCs w:val="20"/>
               </w:rPr>
+              <w:t>Upload, download, cache and temp files</w:t>
+            </w:r>
+          </w:p>
+        </w:tc>
+      </w:tr>
+      <w:tr>
+        <w:trPr>
+          <w:cantSplit w:val="true"/>
+        </w:trPr>
+        <w:tc>
+          <w:tcPr>
+            <w:tcW w:w="1700" w:type="dxa"/>
+            <w:tcBorders>
+              <w:top w:val="single" w:sz="4" w:space="0" w:color="BFBFBF"/>
+              <w:left w:val="single" w:sz="4" w:space="0" w:color="BFBFBF"/>
+              <w:bottom w:val="single" w:sz="4" w:space="0" w:color="BFBFBF"/>
+              <w:right w:val="single" w:sz="4" w:space="0" w:color="BFBFBF"/>
+            </w:tcBorders>
+          </w:tcPr>
+          <w:p>
+            <w:pPr>
+              <w:pStyle w:val="Normal"/>
+              <w:rPr/>
+            </w:pPr>
+            <w:r>
+              <w:rPr>
+                <w:rFonts w:eastAsia="Consolas" w:cs="Consolas" w:ascii="Consolas" w:hAnsi="Consolas"/>
+                <w:sz w:val="20"/>
+                <w:szCs w:val="20"/>
+                <w:shd w:fill="F2F2F2" w:val="clear"/>
+              </w:rPr>
+              <w:t>tactic_db</w:t>
+            </w:r>
+          </w:p>
+        </w:tc>
+        <w:tc>
+          <w:tcPr>
+            <w:tcW w:w="3574" w:type="dxa"/>
+            <w:tcBorders>
+              <w:top w:val="single" w:sz="4" w:space="0" w:color="BFBFBF"/>
+              <w:left w:val="single" w:sz="4" w:space="0" w:color="BFBFBF"/>
+              <w:bottom w:val="single" w:sz="4" w:space="0" w:color="BFBFBF"/>
+              <w:right w:val="single" w:sz="4" w:space="0" w:color="BFBFBF"/>
+            </w:tcBorders>
+          </w:tcPr>
+          <w:p>
+            <w:pPr>
+              <w:pStyle w:val="Normal"/>
+              <w:rPr/>
+            </w:pPr>
+            <w:r>
+              <w:rPr>
+                <w:rFonts w:eastAsia="Consolas" w:cs="Consolas" w:ascii="Consolas" w:hAnsi="Consolas"/>
+                <w:sz w:val="20"/>
+                <w:szCs w:val="20"/>
+                <w:shd w:fill="F2F2F2" w:val="clear"/>
+              </w:rPr>
+              <w:t>db</w:t>
+            </w:r>
+          </w:p>
+        </w:tc>
+        <w:tc>
+          <w:tcPr>
+            <w:tcW w:w="4086" w:type="dxa"/>
+            <w:tcBorders>
+              <w:top w:val="single" w:sz="4" w:space="0" w:color="BFBFBF"/>
+              <w:left w:val="single" w:sz="4" w:space="0" w:color="BFBFBF"/>
+              <w:bottom w:val="single" w:sz="4" w:space="0" w:color="BFBFBF"/>
+              <w:right w:val="single" w:sz="4" w:space="0" w:color="BFBFBF"/>
+            </w:tcBorders>
+          </w:tcPr>
+          <w:p>
+            <w:pPr>
+              <w:pStyle w:val="Normal"/>
+              <w:rPr/>
+            </w:pPr>
+            <w:r>
+              <w:rPr>
+                <w:sz w:val="20"/>
+                <w:szCs w:val="20"/>
+              </w:rPr>
               <w:t>PostgreSQL data directory</w:t>
             </w:r>
           </w:p>
@@ -3082,11 +3634,35 @@
     </w:p>
     <w:p>
       <w:pPr>
+        <w:pStyle w:val="Normal"/>
+        <w:spacing w:before="0" w:after="120"/>
+        <w:rPr/>
+      </w:pPr>
+      <w:r>
+        <w:rPr/>
+        <w:t xml:space="preserve">A host path used for </w:t>
+      </w:r>
+      <w:r>
+        <w:rPr>
+          <w:rFonts w:eastAsia="Consolas" w:cs="Consolas" w:ascii="Consolas" w:hAnsi="Consolas"/>
+          <w:sz w:val="20"/>
+          <w:szCs w:val="20"/>
+          <w:shd w:fill="F2F2F2" w:val="clear"/>
+        </w:rPr>
+        <w:t>TACTIC_ASSETS</w:t>
+      </w:r>
+      <w:r>
+        <w:rPr/>
+        <w:t xml:space="preserve"> must be writable by uid 1000.</w:t>
+      </w:r>
+    </w:p>
+    <w:p>
+      <w:pPr>
         <w:pStyle w:val="Heading2"/>
         <w:rPr/>
       </w:pPr>
-      <w:bookmarkStart w:id="10" w:name="__RefHeading___Toc464_3852137598"/>
-      <w:bookmarkEnd w:id="10"/>
+      <w:bookmarkStart w:id="11" w:name="__RefHeading___Toc566_1750870680"/>
+      <w:bookmarkEnd w:id="11"/>
       <w:r>
         <w:rPr/>
         <w:t>Configuration</w:t>
@@ -3143,8 +3719,8 @@
         </w:tblCellMar>
       </w:tblPr>
       <w:tblGrid>
-        <w:gridCol w:w="4891"/>
-        <w:gridCol w:w="4468"/>
+        <w:gridCol w:w="4680"/>
+        <w:gridCol w:w="4679"/>
       </w:tblGrid>
       <w:tr>
         <w:trPr>
@@ -3153,7 +3729,7 @@
         </w:trPr>
         <w:tc>
           <w:tcPr>
-            <w:tcW w:w="4891" w:type="dxa"/>
+            <w:tcW w:w="4680" w:type="dxa"/>
             <w:tcBorders>
               <w:top w:val="single" w:sz="4" w:space="0" w:color="BFBFBF"/>
               <w:left w:val="single" w:sz="4" w:space="0" w:color="BFBFBF"/>
@@ -3180,7 +3756,7 @@
         </w:tc>
         <w:tc>
           <w:tcPr>
-            <w:tcW w:w="4468" w:type="dxa"/>
+            <w:tcW w:w="4679" w:type="dxa"/>
             <w:tcBorders>
               <w:top w:val="single" w:sz="4" w:space="0" w:color="BFBFBF"/>
               <w:left w:val="single" w:sz="4" w:space="0" w:color="BFBFBF"/>
@@ -3212,7 +3788,7 @@
         </w:trPr>
         <w:tc>
           <w:tcPr>
-            <w:tcW w:w="4891" w:type="dxa"/>
+            <w:tcW w:w="4680" w:type="dxa"/>
             <w:tcBorders>
               <w:top w:val="single" w:sz="4" w:space="0" w:color="BFBFBF"/>
               <w:left w:val="single" w:sz="4" w:space="0" w:color="BFBFBF"/>
@@ -3286,7 +3862,7 @@
         </w:tc>
         <w:tc>
           <w:tcPr>
-            <w:tcW w:w="4468" w:type="dxa"/>
+            <w:tcW w:w="4679" w:type="dxa"/>
             <w:tcBorders>
               <w:top w:val="single" w:sz="4" w:space="0" w:color="BFBFBF"/>
               <w:left w:val="single" w:sz="4" w:space="0" w:color="BFBFBF"/>
@@ -3324,7 +3900,7 @@
         </w:trPr>
         <w:tc>
           <w:tcPr>
-            <w:tcW w:w="4891" w:type="dxa"/>
+            <w:tcW w:w="4680" w:type="dxa"/>
             <w:tcBorders>
               <w:top w:val="single" w:sz="4" w:space="0" w:color="BFBFBF"/>
               <w:left w:val="single" w:sz="4" w:space="0" w:color="BFBFBF"/>
@@ -3350,7 +3926,7 @@
         </w:tc>
         <w:tc>
           <w:tcPr>
-            <w:tcW w:w="4468" w:type="dxa"/>
+            <w:tcW w:w="4679" w:type="dxa"/>
             <w:tcBorders>
               <w:top w:val="single" w:sz="4" w:space="0" w:color="BFBFBF"/>
               <w:left w:val="single" w:sz="4" w:space="0" w:color="BFBFBF"/>
@@ -3388,7 +3964,7 @@
         </w:trPr>
         <w:tc>
           <w:tcPr>
-            <w:tcW w:w="4891" w:type="dxa"/>
+            <w:tcW w:w="4680" w:type="dxa"/>
             <w:tcBorders>
               <w:top w:val="single" w:sz="4" w:space="0" w:color="BFBFBF"/>
               <w:left w:val="single" w:sz="4" w:space="0" w:color="BFBFBF"/>
@@ -3414,7 +3990,7 @@
         </w:tc>
         <w:tc>
           <w:tcPr>
-            <w:tcW w:w="4468" w:type="dxa"/>
+            <w:tcW w:w="4679" w:type="dxa"/>
             <w:tcBorders>
               <w:top w:val="single" w:sz="4" w:space="0" w:color="BFBFBF"/>
               <w:left w:val="single" w:sz="4" w:space="0" w:color="BFBFBF"/>
@@ -3477,7 +4053,7 @@
         </w:trPr>
         <w:tc>
           <w:tcPr>
-            <w:tcW w:w="4891" w:type="dxa"/>
+            <w:tcW w:w="4680" w:type="dxa"/>
             <w:tcBorders>
               <w:top w:val="single" w:sz="4" w:space="0" w:color="BFBFBF"/>
               <w:left w:val="single" w:sz="4" w:space="0" w:color="BFBFBF"/>
@@ -3503,7 +4079,7 @@
         </w:tc>
         <w:tc>
           <w:tcPr>
-            <w:tcW w:w="4468" w:type="dxa"/>
+            <w:tcW w:w="4679" w:type="dxa"/>
             <w:tcBorders>
               <w:top w:val="single" w:sz="4" w:space="0" w:color="BFBFBF"/>
               <w:left w:val="single" w:sz="4" w:space="0" w:color="BFBFBF"/>
@@ -3541,7 +4117,7 @@
         </w:trPr>
         <w:tc>
           <w:tcPr>
-            <w:tcW w:w="4891" w:type="dxa"/>
+            <w:tcW w:w="4680" w:type="dxa"/>
             <w:tcBorders>
               <w:top w:val="single" w:sz="4" w:space="0" w:color="BFBFBF"/>
               <w:left w:val="single" w:sz="4" w:space="0" w:color="BFBFBF"/>
@@ -3567,7 +4143,7 @@
         </w:tc>
         <w:tc>
           <w:tcPr>
-            <w:tcW w:w="4468" w:type="dxa"/>
+            <w:tcW w:w="4679" w:type="dxa"/>
             <w:tcBorders>
               <w:top w:val="single" w:sz="4" w:space="0" w:color="BFBFBF"/>
               <w:left w:val="single" w:sz="4" w:space="0" w:color="BFBFBF"/>
@@ -3590,6 +4166,164 @@
           </w:p>
         </w:tc>
       </w:tr>
+      <w:tr>
+        <w:trPr>
+          <w:cantSplit w:val="true"/>
+        </w:trPr>
+        <w:tc>
+          <w:tcPr>
+            <w:tcW w:w="4680" w:type="dxa"/>
+            <w:tcBorders>
+              <w:top w:val="single" w:sz="4" w:space="0" w:color="BFBFBF"/>
+              <w:left w:val="single" w:sz="4" w:space="0" w:color="BFBFBF"/>
+              <w:bottom w:val="single" w:sz="4" w:space="0" w:color="BFBFBF"/>
+              <w:right w:val="single" w:sz="4" w:space="0" w:color="BFBFBF"/>
+            </w:tcBorders>
+          </w:tcPr>
+          <w:p>
+            <w:pPr>
+              <w:pStyle w:val="Normal"/>
+              <w:rPr/>
+            </w:pPr>
+            <w:r>
+              <w:rPr>
+                <w:rFonts w:eastAsia="Consolas" w:cs="Consolas" w:ascii="Consolas" w:hAnsi="Consolas"/>
+                <w:sz w:val="20"/>
+                <w:szCs w:val="20"/>
+                <w:shd w:fill="F2F2F2" w:val="clear"/>
+              </w:rPr>
+              <w:t>VFX_ENABLED</w:t>
+            </w:r>
+            <w:r>
+              <w:rPr>
+                <w:sz w:val="20"/>
+                <w:szCs w:val="20"/>
+              </w:rPr>
+              <w:t xml:space="preserve">, </w:t>
+            </w:r>
+            <w:r>
+              <w:rPr>
+                <w:rFonts w:eastAsia="Consolas" w:cs="Consolas" w:ascii="Consolas" w:hAnsi="Consolas"/>
+                <w:sz w:val="20"/>
+                <w:szCs w:val="20"/>
+                <w:shd w:fill="F2F2F2" w:val="clear"/>
+              </w:rPr>
+              <w:t>VFX_PROJECT_CODE</w:t>
+            </w:r>
+            <w:r>
+              <w:rPr>
+                <w:sz w:val="20"/>
+                <w:szCs w:val="20"/>
+              </w:rPr>
+              <w:t xml:space="preserve">, </w:t>
+            </w:r>
+            <w:r>
+              <w:rPr>
+                <w:rFonts w:eastAsia="Consolas" w:cs="Consolas" w:ascii="Consolas" w:hAnsi="Consolas"/>
+                <w:sz w:val="20"/>
+                <w:szCs w:val="20"/>
+                <w:shd w:fill="F2F2F2" w:val="clear"/>
+              </w:rPr>
+              <w:t>VFX_PROJECT_TITLE</w:t>
+            </w:r>
+          </w:p>
+        </w:tc>
+        <w:tc>
+          <w:tcPr>
+            <w:tcW w:w="4679" w:type="dxa"/>
+            <w:tcBorders>
+              <w:top w:val="single" w:sz="4" w:space="0" w:color="BFBFBF"/>
+              <w:left w:val="single" w:sz="4" w:space="0" w:color="BFBFBF"/>
+              <w:bottom w:val="single" w:sz="4" w:space="0" w:color="BFBFBF"/>
+              <w:right w:val="single" w:sz="4" w:space="0" w:color="BFBFBF"/>
+            </w:tcBorders>
+          </w:tcPr>
+          <w:p>
+            <w:pPr>
+              <w:pStyle w:val="Normal"/>
+              <w:rPr/>
+            </w:pPr>
+            <w:r>
+              <w:rPr>
+                <w:sz w:val="20"/>
+                <w:szCs w:val="20"/>
+              </w:rPr>
+              <w:t xml:space="preserve">First-start VFX project (read by </w:t>
+            </w:r>
+            <w:r>
+              <w:rPr>
+                <w:rFonts w:eastAsia="Consolas" w:cs="Consolas" w:ascii="Consolas" w:hAnsi="Consolas"/>
+                <w:sz w:val="20"/>
+                <w:szCs w:val="20"/>
+                <w:shd w:fill="F2F2F2" w:val="clear"/>
+              </w:rPr>
+              <w:t>bootstrap_vfx.py</w:t>
+            </w:r>
+            <w:r>
+              <w:rPr>
+                <w:sz w:val="20"/>
+                <w:szCs w:val="20"/>
+              </w:rPr>
+              <w:t>)</w:t>
+            </w:r>
+          </w:p>
+        </w:tc>
+      </w:tr>
+      <w:tr>
+        <w:trPr>
+          <w:cantSplit w:val="true"/>
+        </w:trPr>
+        <w:tc>
+          <w:tcPr>
+            <w:tcW w:w="4680" w:type="dxa"/>
+            <w:tcBorders>
+              <w:top w:val="single" w:sz="4" w:space="0" w:color="BFBFBF"/>
+              <w:left w:val="single" w:sz="4" w:space="0" w:color="BFBFBF"/>
+              <w:bottom w:val="single" w:sz="4" w:space="0" w:color="BFBFBF"/>
+              <w:right w:val="single" w:sz="4" w:space="0" w:color="BFBFBF"/>
+            </w:tcBorders>
+          </w:tcPr>
+          <w:p>
+            <w:pPr>
+              <w:pStyle w:val="Normal"/>
+              <w:rPr/>
+            </w:pPr>
+            <w:r>
+              <w:rPr>
+                <w:rFonts w:eastAsia="Consolas" w:cs="Consolas" w:ascii="Consolas" w:hAnsi="Consolas"/>
+                <w:sz w:val="20"/>
+                <w:szCs w:val="20"/>
+                <w:shd w:fill="F2F2F2" w:val="clear"/>
+              </w:rPr>
+              <w:t>TACTIC_ASSETS</w:t>
+            </w:r>
+          </w:p>
+        </w:tc>
+        <w:tc>
+          <w:tcPr>
+            <w:tcW w:w="4679" w:type="dxa"/>
+            <w:tcBorders>
+              <w:top w:val="single" w:sz="4" w:space="0" w:color="BFBFBF"/>
+              <w:left w:val="single" w:sz="4" w:space="0" w:color="BFBFBF"/>
+              <w:bottom w:val="single" w:sz="4" w:space="0" w:color="BFBFBF"/>
+              <w:right w:val="single" w:sz="4" w:space="0" w:color="BFBFBF"/>
+            </w:tcBorders>
+          </w:tcPr>
+          <w:p>
+            <w:pPr>
+              <w:pStyle w:val="Normal"/>
+              <w:rPr/>
+            </w:pPr>
+            <w:r>
+              <w:rPr>
+                <w:sz w:val="20"/>
+                <w:szCs w:val="20"/>
+              </w:rPr>
+              <w:t>Volume name or host path mounted for media</w:t>
+            </w:r>
+          </w:p>
+        </w:tc>
+      </w:tr>
     </w:tbl>
     <w:p>
       <w:pPr>
@@ -3643,8 +4377,8 @@
         <w:pStyle w:val="Heading2"/>
         <w:rPr/>
       </w:pPr>
-      <w:bookmarkStart w:id="11" w:name="__RefHeading___Toc466_3852137598"/>
-      <w:bookmarkEnd w:id="11"/>
+      <w:bookmarkStart w:id="12" w:name="__RefHeading___Toc568_1750870680"/>
+      <w:bookmarkEnd w:id="12"/>
       <w:r>
         <w:rPr/>
         <w:t>Security and hardening</w:t>
@@ -3655,7 +4389,7 @@
         <w:pStyle w:val="ListParagraph"/>
         <w:numPr>
           <w:ilvl w:val="0"/>
-          <w:numId w:val="22"/>
+          <w:numId w:val="2"/>
         </w:numPr>
         <w:spacing w:before="0" w:after="60"/>
         <w:rPr/>
@@ -3670,7 +4404,7 @@
         <w:pStyle w:val="ListParagraph"/>
         <w:numPr>
           <w:ilvl w:val="0"/>
-          <w:numId w:val="23"/>
+          <w:numId w:val="2"/>
         </w:numPr>
         <w:spacing w:before="0" w:after="60"/>
         <w:rPr/>
@@ -3694,7 +4428,7 @@
         <w:pStyle w:val="ListParagraph"/>
         <w:numPr>
           <w:ilvl w:val="0"/>
-          <w:numId w:val="24"/>
+          <w:numId w:val="2"/>
         </w:numPr>
         <w:spacing w:before="0" w:after="60"/>
         <w:rPr/>
@@ -3731,27 +4465,14 @@
         <w:pStyle w:val="ListParagraph"/>
         <w:numPr>
           <w:ilvl w:val="0"/>
-          <w:numId w:val="25"/>
+          <w:numId w:val="2"/>
         </w:numPr>
         <w:spacing w:before="0" w:after="60"/>
         <w:rPr/>
       </w:pPr>
       <w:r>
         <w:rPr/>
-        <w:t>nginx hides its version (</w:t>
-      </w:r>
-      <w:r>
-        <w:rPr>
-          <w:rFonts w:eastAsia="Consolas" w:cs="Consolas" w:ascii="Consolas" w:hAnsi="Consolas"/>
-          <w:sz w:val="20"/>
-          <w:szCs w:val="20"/>
-          <w:shd w:fill="F2F2F2" w:val="clear"/>
-        </w:rPr>
-        <w:t>server_tokens off</w:t>
-      </w:r>
-      <w:r>
-        <w:rPr/>
-        <w:t>) and sends HSTS when TLS is enabled.</w:t>
+        <w:t>The proxy mounts only the media volume, read-only. It cannot read the TACTIC configuration or the database password.</w:t>
       </w:r>
     </w:p>
     <w:p>
@@ -3759,40 +4480,27 @@
         <w:pStyle w:val="ListParagraph"/>
         <w:numPr>
           <w:ilvl w:val="0"/>
-          <w:numId w:val="26"/>
+          <w:numId w:val="2"/>
         </w:numPr>
         <w:spacing w:before="0" w:after="60"/>
         <w:rPr/>
       </w:pPr>
       <w:r>
         <w:rPr/>
-        <w:t xml:space="preserve">TACTIC's default </w:t>
-      </w:r>
-      <w:r>
-        <w:rPr>
-          <w:rFonts w:eastAsia="Consolas" w:cs="Consolas" w:ascii="Consolas" w:hAnsi="Consolas"/>
-          <w:sz w:val="20"/>
-          <w:szCs w:val="20"/>
-          <w:shd w:fill="F2F2F2" w:val="clear"/>
-        </w:rPr>
-        <w:t>admin</w:t>
-      </w:r>
-      <w:r>
-        <w:rPr/>
-        <w:t xml:space="preserve"> / </w:t>
-      </w:r>
-      <w:r>
-        <w:rPr>
-          <w:rFonts w:eastAsia="Consolas" w:cs="Consolas" w:ascii="Consolas" w:hAnsi="Consolas"/>
-          <w:sz w:val="20"/>
-          <w:szCs w:val="20"/>
-          <w:shd w:fill="F2F2F2" w:val="clear"/>
-        </w:rPr>
-        <w:t>tactic</w:t>
-      </w:r>
-      <w:r>
-        <w:rPr/>
-        <w:t xml:space="preserve"> login is public and must be changed after first login.</w:t>
+        <w:t>nginx hides its version (</w:t>
+      </w:r>
+      <w:r>
+        <w:rPr>
+          <w:rFonts w:eastAsia="Consolas" w:cs="Consolas" w:ascii="Consolas" w:hAnsi="Consolas"/>
+          <w:sz w:val="20"/>
+          <w:szCs w:val="20"/>
+          <w:shd w:fill="F2F2F2" w:val="clear"/>
+        </w:rPr>
+        <w:t>server_tokens off</w:t>
+      </w:r>
+      <w:r>
+        <w:rPr/>
+        <w:t>) and sends HSTS when TLS is enabled.</w:t>
       </w:r>
     </w:p>
     <w:p>
@@ -3800,26 +4508,40 @@
         <w:pStyle w:val="ListParagraph"/>
         <w:numPr>
           <w:ilvl w:val="0"/>
-          <w:numId w:val="27"/>
+          <w:numId w:val="2"/>
         </w:numPr>
         <w:spacing w:before="0" w:after="60"/>
         <w:rPr/>
       </w:pPr>
       <w:r>
         <w:rPr/>
-        <w:t>Root filesystems are writable. Read-only mode has not been tried.</w:t>
-      </w:r>
-    </w:p>
-    <w:p>
-      <w:pPr>
-        <w:pStyle w:val="Heading2"/>
-        <w:rPr/>
-      </w:pPr>
-      <w:bookmarkStart w:id="12" w:name="__RefHeading___Toc468_3852137598"/>
-      <w:bookmarkEnd w:id="12"/>
-      <w:r>
-        <w:rPr/>
-        <w:t>Operations</w:t>
+        <w:t xml:space="preserve">TACTIC's default </w:t>
+      </w:r>
+      <w:r>
+        <w:rPr>
+          <w:rFonts w:eastAsia="Consolas" w:cs="Consolas" w:ascii="Consolas" w:hAnsi="Consolas"/>
+          <w:sz w:val="20"/>
+          <w:szCs w:val="20"/>
+          <w:shd w:fill="F2F2F2" w:val="clear"/>
+        </w:rPr>
+        <w:t>admin</w:t>
+      </w:r>
+      <w:r>
+        <w:rPr/>
+        <w:t xml:space="preserve"> / </w:t>
+      </w:r>
+      <w:r>
+        <w:rPr>
+          <w:rFonts w:eastAsia="Consolas" w:cs="Consolas" w:ascii="Consolas" w:hAnsi="Consolas"/>
+          <w:sz w:val="20"/>
+          <w:szCs w:val="20"/>
+          <w:shd w:fill="F2F2F2" w:val="clear"/>
+        </w:rPr>
+        <w:t>tactic</w:t>
+      </w:r>
+      <w:r>
+        <w:rPr/>
+        <w:t xml:space="preserve"> login is public and must be changed after first login.</w:t>
       </w:r>
     </w:p>
     <w:p>
@@ -3827,34 +4549,26 @@
         <w:pStyle w:val="ListParagraph"/>
         <w:numPr>
           <w:ilvl w:val="0"/>
-          <w:numId w:val="28"/>
+          <w:numId w:val="2"/>
         </w:numPr>
         <w:spacing w:before="0" w:after="60"/>
         <w:rPr/>
       </w:pPr>
       <w:r>
-        <w:rPr>
-          <w:b/>
-          <w:bCs/>
-        </w:rPr>
-        <w:t>Restart policy:</w:t>
-      </w:r>
-      <w:r>
-        <w:rPr/>
-        <w:t xml:space="preserve"> all services use </w:t>
-      </w:r>
-      <w:r>
-        <w:rPr>
-          <w:rFonts w:eastAsia="Consolas" w:cs="Consolas" w:ascii="Consolas" w:hAnsi="Consolas"/>
-          <w:sz w:val="20"/>
-          <w:szCs w:val="20"/>
-          <w:shd w:fill="F2F2F2" w:val="clear"/>
-        </w:rPr>
-        <w:t>restart: always</w:t>
-      </w:r>
-      <w:r>
-        <w:rPr/>
-        <w:t>.</w:t>
+        <w:rPr/>
+        <w:t>Root filesystems are writable. Read-only mode has not been tried.</w:t>
+      </w:r>
+    </w:p>
+    <w:p>
+      <w:pPr>
+        <w:pStyle w:val="Heading2"/>
+        <w:rPr/>
+      </w:pPr>
+      <w:bookmarkStart w:id="13" w:name="__RefHeading___Toc570_1750870680"/>
+      <w:bookmarkEnd w:id="13"/>
+      <w:r>
+        <w:rPr/>
+        <w:t>Operations</w:t>
       </w:r>
     </w:p>
     <w:p>
@@ -3862,7 +4576,7 @@
         <w:pStyle w:val="ListParagraph"/>
         <w:numPr>
           <w:ilvl w:val="0"/>
-          <w:numId w:val="29"/>
+          <w:numId w:val="2"/>
         </w:numPr>
         <w:spacing w:before="0" w:after="60"/>
         <w:rPr/>
@@ -3872,24 +4586,24 @@
           <w:b/>
           <w:bCs/>
         </w:rPr>
-        <w:t>Logs:</w:t>
-      </w:r>
-      <w:r>
-        <w:rPr/>
-        <w:t xml:space="preserve"> </w:t>
-      </w:r>
-      <w:r>
-        <w:rPr>
-          <w:rFonts w:eastAsia="Consolas" w:cs="Consolas" w:ascii="Consolas" w:hAnsi="Consolas"/>
-          <w:sz w:val="20"/>
-          <w:szCs w:val="20"/>
-          <w:shd w:fill="F2F2F2" w:val="clear"/>
-        </w:rPr>
-        <w:t>json-file</w:t>
-      </w:r>
-      <w:r>
-        <w:rPr/>
-        <w:t xml:space="preserve"> driver, 10 MB per file, 5 files per service.</w:t>
+        <w:t>Restart policy:</w:t>
+      </w:r>
+      <w:r>
+        <w:rPr/>
+        <w:t xml:space="preserve"> all services use </w:t>
+      </w:r>
+      <w:r>
+        <w:rPr>
+          <w:rFonts w:eastAsia="Consolas" w:cs="Consolas" w:ascii="Consolas" w:hAnsi="Consolas"/>
+          <w:sz w:val="20"/>
+          <w:szCs w:val="20"/>
+          <w:shd w:fill="F2F2F2" w:val="clear"/>
+        </w:rPr>
+        <w:t>restart: always</w:t>
+      </w:r>
+      <w:r>
+        <w:rPr/>
+        <w:t>.</w:t>
       </w:r>
     </w:p>
     <w:p>
@@ -3897,7 +4611,7 @@
         <w:pStyle w:val="ListParagraph"/>
         <w:numPr>
           <w:ilvl w:val="0"/>
-          <w:numId w:val="30"/>
+          <w:numId w:val="2"/>
         </w:numPr>
         <w:spacing w:before="0" w:after="60"/>
         <w:rPr/>
@@ -3907,24 +4621,24 @@
           <w:b/>
           <w:bCs/>
         </w:rPr>
-        <w:t>Resources:</w:t>
-      </w:r>
-      <w:r>
-        <w:rPr/>
-        <w:t xml:space="preserve"> the app container is limited by </w:t>
-      </w:r>
-      <w:r>
-        <w:rPr>
-          <w:rFonts w:eastAsia="Consolas" w:cs="Consolas" w:ascii="Consolas" w:hAnsi="Consolas"/>
-          <w:sz w:val="20"/>
-          <w:szCs w:val="20"/>
-          <w:shd w:fill="F2F2F2" w:val="clear"/>
-        </w:rPr>
-        <w:t>TACTIC_MEM_LIMIT</w:t>
-      </w:r>
-      <w:r>
-        <w:rPr/>
-        <w:t xml:space="preserve"> (default 4 GB).</w:t>
+        <w:t>Logs:</w:t>
+      </w:r>
+      <w:r>
+        <w:rPr/>
+        <w:t xml:space="preserve"> </w:t>
+      </w:r>
+      <w:r>
+        <w:rPr>
+          <w:rFonts w:eastAsia="Consolas" w:cs="Consolas" w:ascii="Consolas" w:hAnsi="Consolas"/>
+          <w:sz w:val="20"/>
+          <w:szCs w:val="20"/>
+          <w:shd w:fill="F2F2F2" w:val="clear"/>
+        </w:rPr>
+        <w:t>json-file</w:t>
+      </w:r>
+      <w:r>
+        <w:rPr/>
+        <w:t xml:space="preserve"> driver, 10 MB per file, 5 files per service.</w:t>
       </w:r>
     </w:p>
     <w:p>
@@ -3932,7 +4646,7 @@
         <w:pStyle w:val="ListParagraph"/>
         <w:numPr>
           <w:ilvl w:val="0"/>
-          <w:numId w:val="31"/>
+          <w:numId w:val="2"/>
         </w:numPr>
         <w:spacing w:before="0" w:after="60"/>
         <w:rPr/>
@@ -3942,63 +4656,24 @@
           <w:b/>
           <w:bCs/>
         </w:rPr>
-        <w:t>Scaling workers:</w:t>
-      </w:r>
-      <w:r>
-        <w:rPr/>
-        <w:t xml:space="preserve"> change </w:t>
-      </w:r>
-      <w:r>
-        <w:rPr>
-          <w:rFonts w:eastAsia="Consolas" w:cs="Consolas" w:ascii="Consolas" w:hAnsi="Consolas"/>
-          <w:sz w:val="20"/>
-          <w:szCs w:val="20"/>
-          <w:shd w:fill="F2F2F2" w:val="clear"/>
-        </w:rPr>
-        <w:t>TACTIC_PORTS</w:t>
-      </w:r>
-      <w:r>
-        <w:rPr/>
-        <w:t xml:space="preserve"> in </w:t>
-      </w:r>
-      <w:r>
-        <w:rPr>
-          <w:rFonts w:eastAsia="Consolas" w:cs="Consolas" w:ascii="Consolas" w:hAnsi="Consolas"/>
-          <w:sz w:val="20"/>
-          <w:szCs w:val="20"/>
-          <w:shd w:fill="F2F2F2" w:val="clear"/>
-        </w:rPr>
-        <w:t>docker-compose.yml</w:t>
-      </w:r>
-      <w:r>
-        <w:rPr/>
-        <w:t xml:space="preserve"> and the </w:t>
-      </w:r>
-      <w:r>
-        <w:rPr>
-          <w:rFonts w:eastAsia="Consolas" w:cs="Consolas" w:ascii="Consolas" w:hAnsi="Consolas"/>
-          <w:sz w:val="20"/>
-          <w:szCs w:val="20"/>
-          <w:shd w:fill="F2F2F2" w:val="clear"/>
-        </w:rPr>
-        <w:t>server</w:t>
-      </w:r>
-      <w:r>
-        <w:rPr/>
-        <w:t xml:space="preserve"> lines in </w:t>
-      </w:r>
-      <w:r>
-        <w:rPr>
-          <w:rFonts w:eastAsia="Consolas" w:cs="Consolas" w:ascii="Consolas" w:hAnsi="Consolas"/>
-          <w:sz w:val="20"/>
-          <w:szCs w:val="20"/>
-          <w:shd w:fill="F2F2F2" w:val="clear"/>
-        </w:rPr>
-        <w:t>docker/nginx/tactic-upstream.inc</w:t>
-      </w:r>
-      <w:r>
-        <w:rPr/>
-        <w:t>, then rebuild the proxy.</w:t>
+        <w:t>Resources:</w:t>
+      </w:r>
+      <w:r>
+        <w:rPr/>
+        <w:t xml:space="preserve"> the app container is limited by </w:t>
+      </w:r>
+      <w:r>
+        <w:rPr>
+          <w:rFonts w:eastAsia="Consolas" w:cs="Consolas" w:ascii="Consolas" w:hAnsi="Consolas"/>
+          <w:sz w:val="20"/>
+          <w:szCs w:val="20"/>
+          <w:shd w:fill="F2F2F2" w:val="clear"/>
+        </w:rPr>
+        <w:t>TACTIC_MEM_LIMIT</w:t>
+      </w:r>
+      <w:r>
+        <w:rPr/>
+        <w:t xml:space="preserve"> (default 4 GB).</w:t>
       </w:r>
     </w:p>
     <w:p>
@@ -4006,7 +4681,7 @@
         <w:pStyle w:val="ListParagraph"/>
         <w:numPr>
           <w:ilvl w:val="0"/>
-          <w:numId w:val="32"/>
+          <w:numId w:val="2"/>
         </w:numPr>
         <w:spacing w:before="0" w:after="60"/>
         <w:rPr/>
@@ -4016,49 +4691,63 @@
           <w:b/>
           <w:bCs/>
         </w:rPr>
-        <w:t>Backups:</w:t>
-      </w:r>
-      <w:r>
-        <w:rPr/>
-        <w:t xml:space="preserve"> </w:t>
-      </w:r>
-      <w:r>
-        <w:rPr>
-          <w:rFonts w:eastAsia="Consolas" w:cs="Consolas" w:ascii="Consolas" w:hAnsi="Consolas"/>
-          <w:sz w:val="20"/>
-          <w:szCs w:val="20"/>
-          <w:shd w:fill="F2F2F2" w:val="clear"/>
-        </w:rPr>
-        <w:t>pg_dump</w:t>
-      </w:r>
-      <w:r>
-        <w:rPr/>
-        <w:t xml:space="preserve"> for the database and an archive of the </w:t>
-      </w:r>
-      <w:r>
-        <w:rPr>
-          <w:rFonts w:eastAsia="Consolas" w:cs="Consolas" w:ascii="Consolas" w:hAnsi="Consolas"/>
-          <w:sz w:val="20"/>
-          <w:szCs w:val="20"/>
-          <w:shd w:fill="F2F2F2" w:val="clear"/>
-        </w:rPr>
-        <w:t>tactic_data</w:t>
-      </w:r>
-      <w:r>
-        <w:rPr/>
-        <w:t xml:space="preserve"> volume. See the README for commands.</w:t>
-      </w:r>
-    </w:p>
-    <w:p>
-      <w:pPr>
-        <w:pStyle w:val="Heading2"/>
-        <w:rPr/>
-      </w:pPr>
-      <w:bookmarkStart w:id="13" w:name="__RefHeading___Toc470_3852137598"/>
-      <w:bookmarkEnd w:id="13"/>
-      <w:r>
-        <w:rPr/>
-        <w:t>Known limitations</w:t>
+        <w:t>Scaling workers:</w:t>
+      </w:r>
+      <w:r>
+        <w:rPr/>
+        <w:t xml:space="preserve"> change </w:t>
+      </w:r>
+      <w:r>
+        <w:rPr>
+          <w:rFonts w:eastAsia="Consolas" w:cs="Consolas" w:ascii="Consolas" w:hAnsi="Consolas"/>
+          <w:sz w:val="20"/>
+          <w:szCs w:val="20"/>
+          <w:shd w:fill="F2F2F2" w:val="clear"/>
+        </w:rPr>
+        <w:t>TACTIC_PORTS</w:t>
+      </w:r>
+      <w:r>
+        <w:rPr/>
+        <w:t xml:space="preserve"> in </w:t>
+      </w:r>
+      <w:r>
+        <w:rPr>
+          <w:rFonts w:eastAsia="Consolas" w:cs="Consolas" w:ascii="Consolas" w:hAnsi="Consolas"/>
+          <w:sz w:val="20"/>
+          <w:szCs w:val="20"/>
+          <w:shd w:fill="F2F2F2" w:val="clear"/>
+        </w:rPr>
+        <w:t>docker-compose.yml</w:t>
+      </w:r>
+      <w:r>
+        <w:rPr/>
+        <w:t xml:space="preserve"> and the </w:t>
+      </w:r>
+      <w:r>
+        <w:rPr>
+          <w:rFonts w:eastAsia="Consolas" w:cs="Consolas" w:ascii="Consolas" w:hAnsi="Consolas"/>
+          <w:sz w:val="20"/>
+          <w:szCs w:val="20"/>
+          <w:shd w:fill="F2F2F2" w:val="clear"/>
+        </w:rPr>
+        <w:t>server</w:t>
+      </w:r>
+      <w:r>
+        <w:rPr/>
+        <w:t xml:space="preserve"> lines in </w:t>
+      </w:r>
+      <w:r>
+        <w:rPr>
+          <w:rFonts w:eastAsia="Consolas" w:cs="Consolas" w:ascii="Consolas" w:hAnsi="Consolas"/>
+          <w:sz w:val="20"/>
+          <w:szCs w:val="20"/>
+          <w:shd w:fill="F2F2F2" w:val="clear"/>
+        </w:rPr>
+        <w:t>docker/nginx/tactic-upstream.inc</w:t>
+      </w:r>
+      <w:r>
+        <w:rPr/>
+        <w:t>, then rebuild the proxy.</w:t>
       </w:r>
     </w:p>
     <w:p>
@@ -4066,14 +4755,98 @@
         <w:pStyle w:val="ListParagraph"/>
         <w:numPr>
           <w:ilvl w:val="0"/>
-          <w:numId w:val="33"/>
+          <w:numId w:val="2"/>
         </w:numPr>
         <w:spacing w:before="0" w:after="60"/>
         <w:rPr/>
       </w:pPr>
       <w:r>
-        <w:rPr/>
-        <w:t>The workers share one container and one memory limit. A runaway worker can affect the others.</w:t>
+        <w:rPr>
+          <w:b/>
+          <w:bCs/>
+        </w:rPr>
+        <w:t>Backups:</w:t>
+      </w:r>
+      <w:r>
+        <w:rPr/>
+        <w:t xml:space="preserve"> </w:t>
+      </w:r>
+      <w:r>
+        <w:rPr>
+          <w:rFonts w:eastAsia="Consolas" w:cs="Consolas" w:ascii="Consolas" w:hAnsi="Consolas"/>
+          <w:sz w:val="20"/>
+          <w:szCs w:val="20"/>
+          <w:shd w:fill="F2F2F2" w:val="clear"/>
+        </w:rPr>
+        <w:t>pg_dump</w:t>
+      </w:r>
+      <w:r>
+        <w:rPr/>
+        <w:t xml:space="preserve"> for the </w:t>
+      </w:r>
+      <w:r>
+        <w:rPr>
+          <w:rFonts w:eastAsia="Consolas" w:cs="Consolas" w:ascii="Consolas" w:hAnsi="Consolas"/>
+          <w:sz w:val="20"/>
+          <w:szCs w:val="20"/>
+          <w:shd w:fill="F2F2F2" w:val="clear"/>
+        </w:rPr>
+        <w:t>sthpw</w:t>
+      </w:r>
+      <w:r>
+        <w:rPr/>
+        <w:t xml:space="preserve"> and </w:t>
+      </w:r>
+      <w:r>
+        <w:rPr>
+          <w:rFonts w:eastAsia="Consolas" w:cs="Consolas" w:ascii="Consolas" w:hAnsi="Consolas"/>
+          <w:sz w:val="20"/>
+          <w:szCs w:val="20"/>
+          <w:shd w:fill="F2F2F2" w:val="clear"/>
+        </w:rPr>
+        <w:t>vfx</w:t>
+      </w:r>
+      <w:r>
+        <w:rPr/>
+        <w:t xml:space="preserve"> databases, and archives of the </w:t>
+      </w:r>
+      <w:r>
+        <w:rPr>
+          <w:rFonts w:eastAsia="Consolas" w:cs="Consolas" w:ascii="Consolas" w:hAnsi="Consolas"/>
+          <w:sz w:val="20"/>
+          <w:szCs w:val="20"/>
+          <w:shd w:fill="F2F2F2" w:val="clear"/>
+        </w:rPr>
+        <w:t>tactic_data</w:t>
+      </w:r>
+      <w:r>
+        <w:rPr/>
+        <w:t xml:space="preserve"> and </w:t>
+      </w:r>
+      <w:r>
+        <w:rPr>
+          <w:rFonts w:eastAsia="Consolas" w:cs="Consolas" w:ascii="Consolas" w:hAnsi="Consolas"/>
+          <w:sz w:val="20"/>
+          <w:szCs w:val="20"/>
+          <w:shd w:fill="F2F2F2" w:val="clear"/>
+        </w:rPr>
+        <w:t>tactic_assets</w:t>
+      </w:r>
+      <w:r>
+        <w:rPr/>
+        <w:t xml:space="preserve"> volumes. See the README for commands.</w:t>
+      </w:r>
+    </w:p>
+    <w:p>
+      <w:pPr>
+        <w:pStyle w:val="Heading2"/>
+        <w:rPr/>
+      </w:pPr>
+      <w:bookmarkStart w:id="14" w:name="__RefHeading___Toc572_1750870680"/>
+      <w:bookmarkEnd w:id="14"/>
+      <w:r>
+        <w:rPr/>
+        <w:t>Known limitations</w:t>
       </w:r>
     </w:p>
     <w:p>
@@ -4081,14 +4854,14 @@
         <w:pStyle w:val="ListParagraph"/>
         <w:numPr>
           <w:ilvl w:val="0"/>
-          <w:numId w:val="34"/>
+          <w:numId w:val="2"/>
         </w:numPr>
         <w:spacing w:before="0" w:after="60"/>
         <w:rPr/>
       </w:pPr>
       <w:r>
         <w:rPr/>
-        <w:t>Each worker logs "Starting Scheduler" at start-up; TACTIC's optional job queue and watch-folder services are not enabled.</w:t>
+        <w:t>The workers share one container and one memory limit. A runaway worker can affect the others.</w:t>
       </w:r>
     </w:p>
     <w:p>
@@ -4096,7 +4869,65 @@
         <w:pStyle w:val="ListParagraph"/>
         <w:numPr>
           <w:ilvl w:val="0"/>
-          <w:numId w:val="35"/>
+          <w:numId w:val="2"/>
+        </w:numPr>
+        <w:spacing w:before="0" w:after="60"/>
+        <w:rPr/>
+      </w:pPr>
+      <w:r>
+        <w:rPr/>
+        <w:t>Each worker logs "Starting Scheduler" at start-up; TACTIC's optional job queue and watch-folder services are not enabled.</w:t>
+      </w:r>
+    </w:p>
+    <w:p>
+      <w:pPr>
+        <w:pStyle w:val="ListParagraph"/>
+        <w:numPr>
+          <w:ilvl w:val="0"/>
+          <w:numId w:val="2"/>
+        </w:numPr>
+        <w:spacing w:before="0" w:after="60"/>
+        <w:rPr/>
+      </w:pPr>
+      <w:r>
+        <w:rPr/>
+        <w:t>EXR frames get no thumbnails or web renditions (see the VFX project section).</w:t>
+      </w:r>
+    </w:p>
+    <w:p>
+      <w:pPr>
+        <w:pStyle w:val="ListParagraph"/>
+        <w:numPr>
+          <w:ilvl w:val="0"/>
+          <w:numId w:val="2"/>
+        </w:numPr>
+        <w:spacing w:before="0" w:after="60"/>
+        <w:rPr/>
+      </w:pPr>
+      <w:r>
+        <w:rPr/>
+        <w:t xml:space="preserve">If the VFX install fails part way, the project record can already exist. The next start then skips the install and leaves the project incomplete. Remove the project and its </w:t>
+      </w:r>
+      <w:r>
+        <w:rPr>
+          <w:rFonts w:eastAsia="Consolas" w:cs="Consolas" w:ascii="Consolas" w:hAnsi="Consolas"/>
+          <w:sz w:val="20"/>
+          <w:szCs w:val="20"/>
+          <w:shd w:fill="F2F2F2" w:val="clear"/>
+        </w:rPr>
+        <w:t>vfx</w:t>
+      </w:r>
+      <w:r>
+        <w:rPr/>
+        <w:t xml:space="preserve"> database, or the volumes on a new installation, before retrying.</w:t>
+      </w:r>
+    </w:p>
+    <w:p>
+      <w:pPr>
+        <w:pStyle w:val="ListParagraph"/>
+        <w:numPr>
+          <w:ilvl w:val="0"/>
+          <w:numId w:val="2"/>
         </w:numPr>
         <w:spacing w:before="0" w:after="60"/>
         <w:rPr/>
@@ -4204,7 +5035,7 @@
     </w:r>
     <w:r>
       <w:rPr/>
-      <w:t>6</w:t>
+      <w:t>7</w:t>
     </w:r>
     <w:r>
       <w:rPr/>
@@ -4243,7 +5074,7 @@
     </w:r>
     <w:r>
       <w:rPr/>
-      <w:t>6</w:t>
+      <w:t>7</w:t>
     </w:r>
     <w:r>
       <w:rPr/>
@@ -4280,7 +5111,6 @@
         </w:tabs>
         <w:ind w:left="1080" w:hanging="360"/>
       </w:pPr>
-      <w:rPr/>
     </w:lvl>
     <w:lvl w:ilvl="2">
       <w:start w:val="1"/>
@@ -4293,7 +5123,6 @@
         </w:tabs>
         <w:ind w:left="1440" w:hanging="360"/>
       </w:pPr>
-      <w:rPr/>
     </w:lvl>
     <w:lvl w:ilvl="3">
       <w:start w:val="1"/>
@@ -4306,7 +5135,6 @@
         </w:tabs>
         <w:ind w:left="1800" w:hanging="360"/>
       </w:pPr>
-      <w:rPr/>
     </w:lvl>
     <w:lvl w:ilvl="4">
       <w:start w:val="1"/>
@@ -4319,7 +5147,6 @@
         </w:tabs>
         <w:ind w:left="2160" w:hanging="360"/>
       </w:pPr>
-      <w:rPr/>
     </w:lvl>
     <w:lvl w:ilvl="5">
       <w:start w:val="1"/>
@@ -4332,7 +5159,6 @@
         </w:tabs>
         <w:ind w:left="2520" w:hanging="360"/>
       </w:pPr>
-      <w:rPr/>
     </w:lvl>
     <w:lvl w:ilvl="6">
       <w:start w:val="1"/>
@@ -4345,7 +5171,6 @@
         </w:tabs>
         <w:ind w:left="2880" w:hanging="360"/>
       </w:pPr>
-      <w:rPr/>
     </w:lvl>
     <w:lvl w:ilvl="7">
       <w:start w:val="1"/>
@@ -4358,7 +5183,6 @@
         </w:tabs>
         <w:ind w:left="3240" w:hanging="360"/>
       </w:pPr>
-      <w:rPr/>
     </w:lvl>
     <w:lvl w:ilvl="8">
       <w:start w:val="1"/>
@@ -4371,7 +5195,6 @@
         </w:tabs>
         <w:ind w:left="3600" w:hanging="360"/>
       </w:pPr>
-      <w:rPr/>
     </w:lvl>
   </w:abstractNum>
   <w:abstractNum w:abstractNumId="2">
@@ -4401,7 +5224,6 @@
         </w:tabs>
         <w:ind w:left="1080" w:hanging="360"/>
       </w:pPr>
-      <w:rPr/>
     </w:lvl>
     <w:lvl w:ilvl="2">
       <w:start w:val="1"/>
@@ -4414,7 +5236,6 @@
         </w:tabs>
         <w:ind w:left="1440" w:hanging="360"/>
       </w:pPr>
-      <w:rPr/>
     </w:lvl>
     <w:lvl w:ilvl="3">
       <w:start w:val="1"/>
@@ -4427,7 +5248,6 @@
         </w:tabs>
         <w:ind w:left="1800" w:hanging="360"/>
       </w:pPr>
-      <w:rPr/>
     </w:lvl>
     <w:lvl w:ilvl="4">
       <w:start w:val="1"/>
@@ -4440,7 +5260,6 @@
         </w:tabs>
         <w:ind w:left="2160" w:hanging="360"/>
       </w:pPr>
-      <w:rPr/>
     </w:lvl>
     <w:lvl w:ilvl="5">
       <w:start w:val="1"/>
@@ -4453,7 +5272,6 @@
         </w:tabs>
         <w:ind w:left="2520" w:hanging="360"/>
       </w:pPr>
-      <w:rPr/>
     </w:lvl>
     <w:lvl w:ilvl="6">
       <w:start w:val="1"/>
@@ -4466,7 +5284,6 @@
         </w:tabs>
         <w:ind w:left="2880" w:hanging="360"/>
       </w:pPr>
-      <w:rPr/>
     </w:lvl>
     <w:lvl w:ilvl="7">
       <w:start w:val="1"/>
@@ -4479,7 +5296,6 @@
         </w:tabs>
         <w:ind w:left="3240" w:hanging="360"/>
       </w:pPr>
-      <w:rPr/>
     </w:lvl>
     <w:lvl w:ilvl="8">
       <w:start w:val="1"/>
@@ -4492,7 +5308,6 @@
         </w:tabs>
         <w:ind w:left="3600" w:hanging="360"/>
       </w:pPr>
-      <w:rPr/>
     </w:lvl>
   </w:abstractNum>
   <w:abstractNum w:abstractNumId="3">
@@ -4520,7 +5335,6 @@
         </w:tabs>
         <w:ind w:left="1080" w:hanging="360"/>
       </w:pPr>
-      <w:rPr/>
     </w:lvl>
     <w:lvl w:ilvl="2">
       <w:start w:val="1"/>
@@ -4533,7 +5347,6 @@
         </w:tabs>
         <w:ind w:left="1440" w:hanging="360"/>
       </w:pPr>
-      <w:rPr/>
     </w:lvl>
     <w:lvl w:ilvl="3">
       <w:start w:val="1"/>
@@ -4546,7 +5359,6 @@
         </w:tabs>
         <w:ind w:left="1800" w:hanging="360"/>
       </w:pPr>
-      <w:rPr/>
     </w:lvl>
     <w:lvl w:ilvl="4">
       <w:start w:val="1"/>
@@ -4559,7 +5371,6 @@
         </w:tabs>
         <w:ind w:left="2160" w:hanging="360"/>
       </w:pPr>
-      <w:rPr/>
     </w:lvl>
     <w:lvl w:ilvl="5">
       <w:start w:val="1"/>
@@ -4572,7 +5383,6 @@
         </w:tabs>
         <w:ind w:left="2520" w:hanging="360"/>
       </w:pPr>
-      <w:rPr/>
     </w:lvl>
     <w:lvl w:ilvl="6">
       <w:start w:val="1"/>
@@ -4585,7 +5395,6 @@
         </w:tabs>
         <w:ind w:left="2880" w:hanging="360"/>
       </w:pPr>
-      <w:rPr/>
     </w:lvl>
     <w:lvl w:ilvl="7">
       <w:start w:val="1"/>
@@ -4598,7 +5407,6 @@
         </w:tabs>
         <w:ind w:left="3240" w:hanging="360"/>
       </w:pPr>
-      <w:rPr/>
     </w:lvl>
     <w:lvl w:ilvl="8">
       <w:start w:val="1"/>
@@ -4611,369 +5419,9 @@
         </w:tabs>
         <w:ind w:left="3600" w:hanging="360"/>
       </w:pPr>
-      <w:rPr/>
     </w:lvl>
   </w:abstractNum>
   <w:abstractNum w:abstractNumId="4">
-    <w:lvl w:ilvl="0">
-      <w:start w:val="1"/>
-      <w:numFmt w:val="decimal"/>
-      <w:lvlText w:val="%1."/>
-      <w:lvlJc w:val="left"/>
-      <w:pPr>
-        <w:tabs>
-          <w:tab w:val="num" w:pos="0"/>
-        </w:tabs>
-        <w:ind w:left="720" w:hanging="360"/>
-      </w:pPr>
-      <w:rPr/>
-    </w:lvl>
-    <w:lvl w:ilvl="1">
-      <w:start w:val="1"/>
-      <w:numFmt w:val="decimal"/>
-      <w:lvlText w:val="%2."/>
-      <w:lvlJc w:val="left"/>
-      <w:pPr>
-        <w:tabs>
-          <w:tab w:val="num" w:pos="1080"/>
-        </w:tabs>
-        <w:ind w:left="1080" w:hanging="360"/>
-      </w:pPr>
-      <w:rPr/>
-    </w:lvl>
-    <w:lvl w:ilvl="2">
-      <w:start w:val="1"/>
-      <w:numFmt w:val="decimal"/>
-      <w:lvlText w:val="%3."/>
-      <w:lvlJc w:val="left"/>
-      <w:pPr>
-        <w:tabs>
-          <w:tab w:val="num" w:pos="1440"/>
-        </w:tabs>
-        <w:ind w:left="1440" w:hanging="360"/>
-      </w:pPr>
-      <w:rPr/>
-    </w:lvl>
-    <w:lvl w:ilvl="3">
-      <w:start w:val="1"/>
-      <w:numFmt w:val="decimal"/>
-      <w:lvlText w:val="%4."/>
-      <w:lvlJc w:val="left"/>
-      <w:pPr>
-        <w:tabs>
-          <w:tab w:val="num" w:pos="1800"/>
-        </w:tabs>
-        <w:ind w:left="1800" w:hanging="360"/>
-      </w:pPr>
-      <w:rPr/>
-    </w:lvl>
-    <w:lvl w:ilvl="4">
-      <w:start w:val="1"/>
-      <w:numFmt w:val="decimal"/>
-      <w:lvlText w:val="%5."/>
-      <w:lvlJc w:val="left"/>
-      <w:pPr>
-        <w:tabs>
-          <w:tab w:val="num" w:pos="2160"/>
-        </w:tabs>
-        <w:ind w:left="2160" w:hanging="360"/>
-      </w:pPr>
-      <w:rPr/>
-    </w:lvl>
-    <w:lvl w:ilvl="5">
-      <w:start w:val="1"/>
-      <w:numFmt w:val="decimal"/>
-      <w:lvlText w:val="%6."/>
-      <w:lvlJc w:val="left"/>
-      <w:pPr>
-        <w:tabs>
-          <w:tab w:val="num" w:pos="2520"/>
-        </w:tabs>
-        <w:ind w:left="2520" w:hanging="360"/>
-      </w:pPr>
-      <w:rPr/>
-    </w:lvl>
-    <w:lvl w:ilvl="6">
-      <w:start w:val="1"/>
-      <w:numFmt w:val="decimal"/>
-      <w:lvlText w:val="%7."/>
-      <w:lvlJc w:val="left"/>
-      <w:pPr>
-        <w:tabs>
-          <w:tab w:val="num" w:pos="2880"/>
-        </w:tabs>
-        <w:ind w:left="2880" w:hanging="360"/>
-      </w:pPr>
-      <w:rPr/>
-    </w:lvl>
-    <w:lvl w:ilvl="7">
-      <w:start w:val="1"/>
-      <w:numFmt w:val="decimal"/>
-      <w:lvlText w:val="%8."/>
-      <w:lvlJc w:val="left"/>
-      <w:pPr>
-        <w:tabs>
-          <w:tab w:val="num" w:pos="3240"/>
-        </w:tabs>
-        <w:ind w:left="3240" w:hanging="360"/>
-      </w:pPr>
-      <w:rPr/>
-    </w:lvl>
-    <w:lvl w:ilvl="8">
-      <w:start w:val="1"/>
-      <w:numFmt w:val="decimal"/>
-      <w:lvlText w:val="%9."/>
-      <w:lvlJc w:val="left"/>
-      <w:pPr>
-        <w:tabs>
-          <w:tab w:val="num" w:pos="3600"/>
-        </w:tabs>
-        <w:ind w:left="3600" w:hanging="360"/>
-      </w:pPr>
-      <w:rPr/>
-    </w:lvl>
-  </w:abstractNum>
-  <w:abstractNum w:abstractNumId="5">
-    <w:lvl w:ilvl="0">
-      <w:start w:val="1"/>
-      <w:numFmt w:val="bullet"/>
-      <w:lvlText w:val=""/>
-      <w:lvlJc w:val="left"/>
-      <w:pPr>
-        <w:tabs>
-          <w:tab w:val="num" w:pos="0"/>
-        </w:tabs>
-        <w:ind w:left="720" w:hanging="360"/>
-      </w:pPr>
-      <w:rPr>
-        <w:rFonts w:ascii="Symbol" w:hAnsi="Symbol" w:cs="Symbol" w:hint="default"/>
-      </w:rPr>
-    </w:lvl>
-    <w:lvl w:ilvl="1">
-      <w:start w:val="1"/>
-      <w:numFmt w:val="decimal"/>
-      <w:lvlText w:val="%2."/>
-      <w:lvlJc w:val="left"/>
-      <w:pPr>
-        <w:tabs>
-          <w:tab w:val="num" w:pos="1080"/>
-        </w:tabs>
-        <w:ind w:left="1080" w:hanging="360"/>
-      </w:pPr>
-      <w:rPr/>
-    </w:lvl>
-    <w:lvl w:ilvl="2">
-      <w:start w:val="1"/>
-      <w:numFmt w:val="decimal"/>
-      <w:lvlText w:val="%3."/>
-      <w:lvlJc w:val="left"/>
-      <w:pPr>
-        <w:tabs>
-          <w:tab w:val="num" w:pos="1440"/>
-        </w:tabs>
-        <w:ind w:left="1440" w:hanging="360"/>
-      </w:pPr>
-      <w:rPr/>
-    </w:lvl>
-    <w:lvl w:ilvl="3">
-      <w:start w:val="1"/>
-      <w:numFmt w:val="decimal"/>
-      <w:lvlText w:val="%4."/>
-      <w:lvlJc w:val="left"/>
-      <w:pPr>
-        <w:tabs>
-          <w:tab w:val="num" w:pos="1800"/>
-        </w:tabs>
-        <w:ind w:left="1800" w:hanging="360"/>
-      </w:pPr>
-      <w:rPr/>
-    </w:lvl>
-    <w:lvl w:ilvl="4">
-      <w:start w:val="1"/>
-      <w:numFmt w:val="decimal"/>
-      <w:lvlText w:val="%5."/>
-      <w:lvlJc w:val="left"/>
-      <w:pPr>
-        <w:tabs>
-          <w:tab w:val="num" w:pos="2160"/>
-        </w:tabs>
-        <w:ind w:left="2160" w:hanging="360"/>
-      </w:pPr>
-      <w:rPr/>
-    </w:lvl>
-    <w:lvl w:ilvl="5">
-      <w:start w:val="1"/>
-      <w:numFmt w:val="decimal"/>
-      <w:lvlText w:val="%6."/>
-      <w:lvlJc w:val="left"/>
-      <w:pPr>
-        <w:tabs>
-          <w:tab w:val="num" w:pos="2520"/>
-        </w:tabs>
-        <w:ind w:left="2520" w:hanging="360"/>
-      </w:pPr>
-      <w:rPr/>
-    </w:lvl>
-    <w:lvl w:ilvl="6">
-      <w:start w:val="1"/>
-      <w:numFmt w:val="decimal"/>
-      <w:lvlText w:val="%7."/>
-      <w:lvlJc w:val="left"/>
-      <w:pPr>
-        <w:tabs>
-          <w:tab w:val="num" w:pos="2880"/>
-        </w:tabs>
-        <w:ind w:left="2880" w:hanging="360"/>
-      </w:pPr>
-      <w:rPr/>
-    </w:lvl>
-    <w:lvl w:ilvl="7">
-      <w:start w:val="1"/>
-      <w:numFmt w:val="decimal"/>
-      <w:lvlText w:val="%8."/>
-      <w:lvlJc w:val="left"/>
-      <w:pPr>
-        <w:tabs>
-          <w:tab w:val="num" w:pos="3240"/>
-        </w:tabs>
-        <w:ind w:left="3240" w:hanging="360"/>
-      </w:pPr>
-      <w:rPr/>
-    </w:lvl>
-    <w:lvl w:ilvl="8">
-      <w:start w:val="1"/>
-      <w:numFmt w:val="decimal"/>
-      <w:lvlText w:val="%9."/>
-      <w:lvlJc w:val="left"/>
-      <w:pPr>
-        <w:tabs>
-          <w:tab w:val="num" w:pos="3600"/>
-        </w:tabs>
-        <w:ind w:left="3600" w:hanging="360"/>
-      </w:pPr>
-      <w:rPr/>
-    </w:lvl>
-  </w:abstractNum>
-  <w:abstractNum w:abstractNumId="6">
-    <w:lvl w:ilvl="0">
-      <w:start w:val="1"/>
-      <w:numFmt w:val="decimal"/>
-      <w:lvlText w:val="%1."/>
-      <w:lvlJc w:val="left"/>
-      <w:pPr>
-        <w:tabs>
-          <w:tab w:val="num" w:pos="0"/>
-        </w:tabs>
-        <w:ind w:left="720" w:hanging="360"/>
-      </w:pPr>
-      <w:rPr/>
-    </w:lvl>
-    <w:lvl w:ilvl="1">
-      <w:start w:val="1"/>
-      <w:numFmt w:val="decimal"/>
-      <w:lvlText w:val="%2."/>
-      <w:lvlJc w:val="left"/>
-      <w:pPr>
-        <w:tabs>
-          <w:tab w:val="num" w:pos="1080"/>
-        </w:tabs>
-        <w:ind w:left="1080" w:hanging="360"/>
-      </w:pPr>
-      <w:rPr/>
-    </w:lvl>
-    <w:lvl w:ilvl="2">
-      <w:start w:val="1"/>
-      <w:numFmt w:val="decimal"/>
-      <w:lvlText w:val="%3."/>
-      <w:lvlJc w:val="left"/>
-      <w:pPr>
-        <w:tabs>
-          <w:tab w:val="num" w:pos="1440"/>
-        </w:tabs>
-        <w:ind w:left="1440" w:hanging="360"/>
-      </w:pPr>
-      <w:rPr/>
-    </w:lvl>
-    <w:lvl w:ilvl="3">
-      <w:start w:val="1"/>
-      <w:numFmt w:val="decimal"/>
-      <w:lvlText w:val="%4."/>
-      <w:lvlJc w:val="left"/>
-      <w:pPr>
-        <w:tabs>
-          <w:tab w:val="num" w:pos="1800"/>
-        </w:tabs>
-        <w:ind w:left="1800" w:hanging="360"/>
-      </w:pPr>
-      <w:rPr/>
-    </w:lvl>
-    <w:lvl w:ilvl="4">
-      <w:start w:val="1"/>
-      <w:numFmt w:val="decimal"/>
-      <w:lvlText w:val="%5."/>
-      <w:lvlJc w:val="left"/>
-      <w:pPr>
-        <w:tabs>
-          <w:tab w:val="num" w:pos="2160"/>
-        </w:tabs>
-        <w:ind w:left="2160" w:hanging="360"/>
-      </w:pPr>
-      <w:rPr/>
-    </w:lvl>
-    <w:lvl w:ilvl="5">
-      <w:start w:val="1"/>
-      <w:numFmt w:val="decimal"/>
-      <w:lvlText w:val="%6."/>
-      <w:lvlJc w:val="left"/>
-      <w:pPr>
-        <w:tabs>
-          <w:tab w:val="num" w:pos="2520"/>
-        </w:tabs>
-        <w:ind w:left="2520" w:hanging="360"/>
-      </w:pPr>
-      <w:rPr/>
-    </w:lvl>
-    <w:lvl w:ilvl="6">
-      <w:start w:val="1"/>
-      <w:numFmt w:val="decimal"/>
-      <w:lvlText w:val="%7."/>
-      <w:lvlJc w:val="left"/>
-      <w:pPr>
-        <w:tabs>
-          <w:tab w:val="num" w:pos="2880"/>
-        </w:tabs>
-        <w:ind w:left="2880" w:hanging="360"/>
-      </w:pPr>
-      <w:rPr/>
-    </w:lvl>
-    <w:lvl w:ilvl="7">
-      <w:start w:val="1"/>
-      <w:numFmt w:val="decimal"/>
-      <w:lvlText w:val="%8."/>
-      <w:lvlJc w:val="left"/>
-      <w:pPr>
-        <w:tabs>
-          <w:tab w:val="num" w:pos="3240"/>
-        </w:tabs>
-        <w:ind w:left="3240" w:hanging="360"/>
-      </w:pPr>
-      <w:rPr/>
-    </w:lvl>
-    <w:lvl w:ilvl="8">
-      <w:start w:val="1"/>
-      <w:numFmt w:val="decimal"/>
-      <w:lvlText w:val="%9."/>
-      <w:lvlJc w:val="left"/>
-      <w:pPr>
-        <w:tabs>
-          <w:tab w:val="num" w:pos="3600"/>
-        </w:tabs>
-        <w:ind w:left="3600" w:hanging="360"/>
-      </w:pPr>
-      <w:rPr/>
-    </w:lvl>
-  </w:abstractNum>
-  <w:abstractNum w:abstractNumId="7">
     <w:lvl w:ilvl="0">
       <w:start w:val="1"/>
       <w:numFmt w:val="none"/>
@@ -5105,106 +5553,22 @@
     <w:abstractNumId w:val="4"/>
   </w:num>
   <w:num w:numId="5">
-    <w:abstractNumId w:val="5"/>
-  </w:num>
-  <w:num w:numId="6">
-    <w:abstractNumId w:val="6"/>
-  </w:num>
-  <w:num w:numId="7">
-    <w:abstractNumId w:val="7"/>
-  </w:num>
-  <w:num w:numId="8">
-    <w:abstractNumId w:val="4"/>
+    <w:abstractNumId w:val="1"/>
     <w:lvlOverride w:ilvl="0">
       <w:startOverride w:val="1"/>
     </w:lvlOverride>
   </w:num>
-  <w:num w:numId="9">
-    <w:abstractNumId w:val="4"/>
-  </w:num>
-  <w:num w:numId="10">
-    <w:abstractNumId w:val="4"/>
-  </w:num>
-  <w:num w:numId="11">
-    <w:abstractNumId w:val="4"/>
-  </w:num>
-  <w:num w:numId="12">
-    <w:abstractNumId w:val="4"/>
-  </w:num>
-  <w:num w:numId="13">
-    <w:abstractNumId w:val="5"/>
+  <w:num w:numId="6">
+    <w:abstractNumId w:val="2"/>
     <w:lvlOverride w:ilvl="0">
       <w:startOverride w:val="1"/>
     </w:lvlOverride>
   </w:num>
-  <w:num w:numId="14">
-    <w:abstractNumId w:val="5"/>
-  </w:num>
-  <w:num w:numId="15">
-    <w:abstractNumId w:val="5"/>
-  </w:num>
-  <w:num w:numId="16">
-    <w:abstractNumId w:val="6"/>
+  <w:num w:numId="7">
+    <w:abstractNumId w:val="3"/>
     <w:lvlOverride w:ilvl="0">
       <w:startOverride w:val="1"/>
     </w:lvlOverride>
-  </w:num>
-  <w:num w:numId="17">
-    <w:abstractNumId w:val="6"/>
-  </w:num>
-  <w:num w:numId="18">
-    <w:abstractNumId w:val="6"/>
-  </w:num>
-  <w:num w:numId="19">
-    <w:abstractNumId w:val="6"/>
-  </w:num>
-  <w:num w:numId="20">
-    <w:abstractNumId w:val="6"/>
-  </w:num>
-  <w:num w:numId="21">
-    <w:abstractNumId w:val="6"/>
-  </w:num>
-  <w:num w:numId="22">
-    <w:abstractNumId w:val="5"/>
-  </w:num>
-  <w:num w:numId="23">
-    <w:abstractNumId w:val="5"/>
-  </w:num>
-  <w:num w:numId="24">
-    <w:abstractNumId w:val="5"/>
-  </w:num>
-  <w:num w:numId="25">
-    <w:abstractNumId w:val="5"/>
-  </w:num>
-  <w:num w:numId="26">
-    <w:abstractNumId w:val="5"/>
-  </w:num>
-  <w:num w:numId="27">
-    <w:abstractNumId w:val="5"/>
-  </w:num>
-  <w:num w:numId="28">
-    <w:abstractNumId w:val="5"/>
-  </w:num>
-  <w:num w:numId="29">
-    <w:abstractNumId w:val="5"/>
-  </w:num>
-  <w:num w:numId="30">
-    <w:abstractNumId w:val="5"/>
-  </w:num>
-  <w:num w:numId="31">
-    <w:abstractNumId w:val="5"/>
-  </w:num>
-  <w:num w:numId="32">
-    <w:abstractNumId w:val="5"/>
-  </w:num>
-  <w:num w:numId="33">
-    <w:abstractNumId w:val="5"/>
-  </w:num>
-  <w:num w:numId="34">
-    <w:abstractNumId w:val="5"/>
-  </w:num>
-  <w:num w:numId="35">
-    <w:abstractNumId w:val="5"/>
   </w:num>
 </w:numbering>
 </file>
@@ -5231,7 +5595,6 @@
     <w:qFormat/>
     <w:pPr>
       <w:widowControl/>
-      <w:suppressAutoHyphens w:val="true"/>
       <w:bidi w:val="0"/>
       <w:spacing w:before="0" w:after="0"/>
       <w:jc w:val="left"/>

</xml_diff>

<commit_message>
Use the mlw plugin from the TACTIC magiclantern branch
Build TACTIC from the magiclantern branch (TACTIC_REF) and create the
production project from its mlw plugin on first start. Replace the
VFX-specific bootstrap with a generic bootstrap_project.py driven by
TACTIC_PROJECT_ENABLED, TACTIC_PLUGIN, TACTIC_PROJECT_CODE and
TACTIC_PROJECT_TITLE, so the vfx plugin is still available.

The mlw plugin is the vfx plugin with the names changed. Regenerate the
architecture, sthpw schema and project schema documents for MLW, replace
the VFX schema document with an MLW one, and update the README.

Co-Authored-By: Claude Sonnet 5.5 <noreply@anthropic.com>
</commit_message>
<xml_diff>
--- a/doc/mlw-TACTIC-docker_Architecture.docx
+++ b/doc/mlw-TACTIC-docker_Architecture.docx
@@ -76,7 +76,7 @@
             </w:rPr>
             <w:fldChar w:fldCharType="separate"/>
           </w:r>
-          <w:hyperlink w:anchor="__RefHeading___Toc544_1750870680">
+          <w:hyperlink w:anchor="__RefHeading___Toc572_2820361070">
             <w:r>
               <w:rPr>
                 <w:rStyle w:val="IndexLink"/>
@@ -96,7 +96,7 @@
             </w:tabs>
             <w:rPr/>
           </w:pPr>
-          <w:hyperlink w:anchor="__RefHeading___Toc546_1750870680">
+          <w:hyperlink w:anchor="__RefHeading___Toc574_2820361070">
             <w:r>
               <w:rPr>
                 <w:rStyle w:val="IndexLink"/>
@@ -116,7 +116,7 @@
             </w:tabs>
             <w:rPr/>
           </w:pPr>
-          <w:hyperlink w:anchor="__RefHeading___Toc548_1750870680">
+          <w:hyperlink w:anchor="__RefHeading___Toc576_2820361070">
             <w:r>
               <w:rPr>
                 <w:rStyle w:val="IndexLink"/>
@@ -136,7 +136,7 @@
             </w:tabs>
             <w:rPr/>
           </w:pPr>
-          <w:hyperlink w:anchor="__RefHeading___Toc550_1750870680">
+          <w:hyperlink w:anchor="__RefHeading___Toc578_2820361070">
             <w:r>
               <w:rPr>
                 <w:rStyle w:val="IndexLink"/>
@@ -156,7 +156,7 @@
             </w:tabs>
             <w:rPr/>
           </w:pPr>
-          <w:hyperlink w:anchor="__RefHeading___Toc552_1750870680">
+          <w:hyperlink w:anchor="__RefHeading___Toc580_2820361070">
             <w:r>
               <w:rPr>
                 <w:rStyle w:val="IndexLink"/>
@@ -176,7 +176,7 @@
             </w:tabs>
             <w:rPr/>
           </w:pPr>
-          <w:hyperlink w:anchor="__RefHeading___Toc554_1750870680">
+          <w:hyperlink w:anchor="__RefHeading___Toc582_2820361070">
             <w:r>
               <w:rPr>
                 <w:rStyle w:val="IndexLink"/>
@@ -196,7 +196,7 @@
             </w:tabs>
             <w:rPr/>
           </w:pPr>
-          <w:hyperlink w:anchor="__RefHeading___Toc556_1750870680">
+          <w:hyperlink w:anchor="__RefHeading___Toc584_2820361070">
             <w:r>
               <w:rPr>
                 <w:rStyle w:val="IndexLink"/>
@@ -216,7 +216,7 @@
             </w:tabs>
             <w:rPr/>
           </w:pPr>
-          <w:hyperlink w:anchor="__RefHeading___Toc558_1750870680">
+          <w:hyperlink w:anchor="__RefHeading___Toc586_2820361070">
             <w:r>
               <w:rPr>
                 <w:rStyle w:val="IndexLink"/>
@@ -236,12 +236,12 @@
             </w:tabs>
             <w:rPr/>
           </w:pPr>
-          <w:hyperlink w:anchor="__RefHeading___Toc560_1750870680">
+          <w:hyperlink w:anchor="__RefHeading___Toc588_2820361070">
             <w:r>
               <w:rPr>
                 <w:rStyle w:val="IndexLink"/>
               </w:rPr>
-              <w:t>VFX project</w:t>
+              <w:t>MLW project</w:t>
               <w:tab/>
               <w:t>5</w:t>
             </w:r>
@@ -256,7 +256,7 @@
             </w:tabs>
             <w:rPr/>
           </w:pPr>
-          <w:hyperlink w:anchor="__RefHeading___Toc562_1750870680">
+          <w:hyperlink w:anchor="__RefHeading___Toc590_2820361070">
             <w:r>
               <w:rPr>
                 <w:rStyle w:val="IndexLink"/>
@@ -276,14 +276,14 @@
             </w:tabs>
             <w:rPr/>
           </w:pPr>
-          <w:hyperlink w:anchor="__RefHeading___Toc564_1750870680">
+          <w:hyperlink w:anchor="__RefHeading___Toc592_2820361070">
             <w:r>
               <w:rPr>
                 <w:rStyle w:val="IndexLink"/>
               </w:rPr>
               <w:t>Storage</w:t>
               <w:tab/>
-              <w:t>5</w:t>
+              <w:t>6</w:t>
             </w:r>
           </w:hyperlink>
         </w:p>
@@ -296,7 +296,7 @@
             </w:tabs>
             <w:rPr/>
           </w:pPr>
-          <w:hyperlink w:anchor="__RefHeading___Toc566_1750870680">
+          <w:hyperlink w:anchor="__RefHeading___Toc594_2820361070">
             <w:r>
               <w:rPr>
                 <w:rStyle w:val="IndexLink"/>
@@ -316,7 +316,7 @@
             </w:tabs>
             <w:rPr/>
           </w:pPr>
-          <w:hyperlink w:anchor="__RefHeading___Toc568_1750870680">
+          <w:hyperlink w:anchor="__RefHeading___Toc596_2820361070">
             <w:r>
               <w:rPr>
                 <w:rStyle w:val="IndexLink"/>
@@ -336,7 +336,7 @@
             </w:tabs>
             <w:rPr/>
           </w:pPr>
-          <w:hyperlink w:anchor="__RefHeading___Toc570_1750870680">
+          <w:hyperlink w:anchor="__RefHeading___Toc598_2820361070">
             <w:r>
               <w:rPr>
                 <w:rStyle w:val="IndexLink"/>
@@ -356,7 +356,7 @@
             </w:tabs>
             <w:rPr/>
           </w:pPr>
-          <w:hyperlink w:anchor="__RefHeading___Toc572_1750870680">
+          <w:hyperlink w:anchor="__RefHeading___Toc600_2820361070">
             <w:r>
               <w:rPr>
                 <w:rStyle w:val="IndexLink"/>
@@ -406,7 +406,7 @@
         <w:spacing w:before="0" w:after="160"/>
         <w:rPr/>
       </w:pPr>
-      <w:bookmarkStart w:id="0" w:name="__RefHeading___Toc544_1750870680"/>
+      <w:bookmarkStart w:id="0" w:name="__RefHeading___Toc572_2820361070"/>
       <w:bookmarkEnd w:id="0"/>
       <w:r>
         <w:rPr/>
@@ -421,7 +421,33 @@
       </w:pPr>
       <w:r>
         <w:rPr/>
-        <w:t>The deployment is three containers on a private compose network. Only the proxy publishes ports to the host. It is set up for VFX production: on first start the app creates a VFX project from TACTIC's built-in VFX plugin, alongside TACTIC's own system database.</w:t>
+        <w:t xml:space="preserve">The deployment is three containers on a private compose network. Only the proxy publishes ports to the host. It is set up for Magic Lantern Workbench (MLW) production: on first start the app creates an MLW project from the </w:t>
+      </w:r>
+      <w:r>
+        <w:rPr>
+          <w:rFonts w:eastAsia="Consolas" w:cs="Consolas" w:ascii="Consolas" w:hAnsi="Consolas"/>
+          <w:sz w:val="20"/>
+          <w:szCs w:val="20"/>
+          <w:shd w:fill="F2F2F2" w:val="clear"/>
+        </w:rPr>
+        <w:t>mlw</w:t>
+      </w:r>
+      <w:r>
+        <w:rPr/>
+        <w:t xml:space="preserve"> plugin of the TACTIC </w:t>
+      </w:r>
+      <w:r>
+        <w:rPr>
+          <w:rFonts w:eastAsia="Consolas" w:cs="Consolas" w:ascii="Consolas" w:hAnsi="Consolas"/>
+          <w:sz w:val="20"/>
+          <w:szCs w:val="20"/>
+          <w:shd w:fill="F2F2F2" w:val="clear"/>
+        </w:rPr>
+        <w:t>magiclantern</w:t>
+      </w:r>
+      <w:r>
+        <w:rPr/>
+        <w:t xml:space="preserve"> branch, alongside TACTIC's own system database.</w:t>
       </w:r>
     </w:p>
     <w:p>
@@ -436,7 +462,7 @@
         <w:rPr/>
         <w:drawing>
           <wp:inline distT="0" distB="0" distL="0" distR="0">
-            <wp:extent cx="4937760" cy="4003040"/>
+            <wp:extent cx="4937760" cy="3978275"/>
             <wp:effectExtent l="0" t="0" r="0" b="0"/>
             <wp:docPr id="1" name="architecture" descr="Architecture diagram&#10;Client, nginx proxy, three TACTIC workers, PostgreSQL and volumes"/>
             <wp:cNvGraphicFramePr>
@@ -460,7 +486,7 @@
                   <pic:spPr bwMode="auto">
                     <a:xfrm>
                       <a:off x="0" y="0"/>
-                      <a:ext cx="4937760" cy="4003040"/>
+                      <a:ext cx="4937760" cy="3978275"/>
                     </a:xfrm>
                     <a:prstGeom prst="rect">
                       <a:avLst/>
@@ -875,14 +901,14 @@
                 <w:szCs w:val="20"/>
                 <w:shd w:fill="F2F2F2" w:val="clear"/>
               </w:rPr>
-              <w:t>vfx</w:t>
-            </w:r>
-            <w:r>
-              <w:rPr>
-                <w:sz w:val="20"/>
-                <w:szCs w:val="20"/>
-              </w:rPr>
-              <w:t xml:space="preserve"> (the VFX project)</w:t>
+              <w:t>mlw</w:t>
+            </w:r>
+            <w:r>
+              <w:rPr>
+                <w:sz w:val="20"/>
+                <w:szCs w:val="20"/>
+              </w:rPr>
+              <w:t xml:space="preserve"> (the MLW project)</w:t>
             </w:r>
           </w:p>
         </w:tc>
@@ -906,7 +932,7 @@
         <w:pStyle w:val="Heading1"/>
         <w:rPr/>
       </w:pPr>
-      <w:bookmarkStart w:id="1" w:name="__RefHeading___Toc546_1750870680"/>
+      <w:bookmarkStart w:id="1" w:name="__RefHeading___Toc574_2820361070"/>
       <w:bookmarkEnd w:id="1"/>
       <w:r>
         <w:rPr/>
@@ -918,7 +944,7 @@
         <w:pStyle w:val="Heading2"/>
         <w:rPr/>
       </w:pPr>
-      <w:bookmarkStart w:id="2" w:name="__RefHeading___Toc548_1750870680"/>
+      <w:bookmarkStart w:id="2" w:name="__RefHeading___Toc576_2820361070"/>
       <w:bookmarkEnd w:id="2"/>
       <w:r>
         <w:rPr/>
@@ -1187,7 +1213,7 @@
         <w:pStyle w:val="Heading2"/>
         <w:rPr/>
       </w:pPr>
-      <w:bookmarkStart w:id="3" w:name="__RefHeading___Toc550_1750870680"/>
+      <w:bookmarkStart w:id="3" w:name="__RefHeading___Toc578_2820361070"/>
       <w:bookmarkEnd w:id="3"/>
       <w:r>
         <w:rPr/>
@@ -1706,7 +1732,7 @@
         <w:pStyle w:val="Heading2"/>
         <w:rPr/>
       </w:pPr>
-      <w:bookmarkStart w:id="4" w:name="__RefHeading___Toc552_1750870680"/>
+      <w:bookmarkStart w:id="4" w:name="__RefHeading___Toc580_2820361070"/>
       <w:bookmarkEnd w:id="4"/>
       <w:r>
         <w:rPr/>
@@ -1718,7 +1744,7 @@
         <w:pStyle w:val="Heading3"/>
         <w:rPr/>
       </w:pPr>
-      <w:bookmarkStart w:id="5" w:name="__RefHeading___Toc554_1750870680"/>
+      <w:bookmarkStart w:id="5" w:name="__RefHeading___Toc582_2820361070"/>
       <w:bookmarkEnd w:id="5"/>
       <w:r>
         <w:rPr/>
@@ -1794,7 +1820,20 @@
       </w:r>
       <w:r>
         <w:rPr/>
-        <w:t xml:space="preserve">, records the commit in </w:t>
+        <w:t xml:space="preserve"> (by default the </w:t>
+      </w:r>
+      <w:r>
+        <w:rPr>
+          <w:rFonts w:eastAsia="Consolas" w:cs="Consolas" w:ascii="Consolas" w:hAnsi="Consolas"/>
+          <w:sz w:val="20"/>
+          <w:szCs w:val="20"/>
+          <w:shd w:fill="F2F2F2" w:val="clear"/>
+        </w:rPr>
+        <w:t>magiclantern</w:t>
+      </w:r>
+      <w:r>
+        <w:rPr/>
+        <w:t xml:space="preserve"> branch), records the commit in </w:t>
       </w:r>
       <w:r>
         <w:rPr>
@@ -2048,7 +2087,7 @@
         <w:pStyle w:val="Heading3"/>
         <w:rPr/>
       </w:pPr>
-      <w:bookmarkStart w:id="6" w:name="__RefHeading___Toc556_1750870680"/>
+      <w:bookmarkStart w:id="6" w:name="__RefHeading___Toc584_2820361070"/>
       <w:bookmarkEnd w:id="6"/>
       <w:r>
         <w:rPr/>
@@ -2238,7 +2277,7 @@
         <w:pStyle w:val="Heading3"/>
         <w:rPr/>
       </w:pPr>
-      <w:bookmarkStart w:id="7" w:name="__RefHeading___Toc558_1750870680"/>
+      <w:bookmarkStart w:id="7" w:name="__RefHeading___Toc586_2820361070"/>
       <w:bookmarkEnd w:id="7"/>
       <w:r>
         <w:rPr/>
@@ -2325,7 +2364,20 @@
           <w:szCs w:val="20"/>
           <w:shd w:fill="F2F2F2" w:val="clear"/>
         </w:rPr>
-        <w:t>VFX_*</w:t>
+        <w:t>TACTIC_PLUGIN</w:t>
+      </w:r>
+      <w:r>
+        <w:rPr/>
+        <w:t>/</w:t>
+      </w:r>
+      <w:r>
+        <w:rPr>
+          <w:rFonts w:eastAsia="Consolas" w:cs="Consolas" w:ascii="Consolas" w:hAnsi="Consolas"/>
+          <w:sz w:val="20"/>
+          <w:szCs w:val="20"/>
+          <w:shd w:fill="F2F2F2" w:val="clear"/>
+        </w:rPr>
+        <w:t>TACTIC_PROJECT_*</w:t>
       </w:r>
       <w:r>
         <w:rPr/>
@@ -2541,7 +2593,7 @@
           <w:szCs w:val="20"/>
           <w:shd w:fill="F2F2F2" w:val="clear"/>
         </w:rPr>
-        <w:t>docker/bootstrap_vfx.py</w:t>
+        <w:t>docker/bootstrap_project.py</w:t>
       </w:r>
       <w:r>
         <w:rPr/>
@@ -2554,7 +2606,7 @@
           <w:szCs w:val="20"/>
           <w:shd w:fill="F2F2F2" w:val="clear"/>
         </w:rPr>
-        <w:t>VFX_ENABLED</w:t>
+        <w:t>TACTIC_PROJECT_ENABLED</w:t>
       </w:r>
       <w:r>
         <w:rPr/>
@@ -2636,7 +2688,7 @@
       </w:r>
       <w:r>
         <w:rPr/>
-        <w:t>, which stops every later upgrade step and leaves the database missing columns that the VFX installer needs.</w:t>
+        <w:t>, which stops every later upgrade step and leaves the database missing columns that the project installer needs.</w:t>
       </w:r>
     </w:p>
     <w:p>
@@ -2644,11 +2696,11 @@
         <w:pStyle w:val="Heading2"/>
         <w:rPr/>
       </w:pPr>
-      <w:bookmarkStart w:id="8" w:name="__RefHeading___Toc560_1750870680"/>
+      <w:bookmarkStart w:id="8" w:name="__RefHeading___Toc588_2820361070"/>
       <w:bookmarkEnd w:id="8"/>
       <w:r>
         <w:rPr/>
-        <w:t>VFX project</w:t>
+        <w:t>MLW project</w:t>
       </w:r>
     </w:p>
     <w:p>
@@ -2664,11 +2716,11 @@
           <w:szCs w:val="20"/>
           <w:shd w:fill="F2F2F2" w:val="clear"/>
         </w:rPr>
-        <w:t>docker/bootstrap_vfx.py</w:t>
-      </w:r>
-      <w:r>
-        <w:rPr/>
-        <w:t xml:space="preserve"> does what the Create Project dialog does when "VFX (built in)" is chosen. It runs TACTIC's </w:t>
+        <w:t>docker/bootstrap_project.py</w:t>
+      </w:r>
+      <w:r>
+        <w:rPr/>
+        <w:t xml:space="preserve"> does what the Create Project dialog does when a built-in template is chosen. It runs TACTIC's </w:t>
       </w:r>
       <w:r>
         <w:rPr>
@@ -2690,11 +2742,128 @@
           <w:szCs w:val="20"/>
           <w:shd w:fill="F2F2F2" w:val="clear"/>
         </w:rPr>
-        <w:t>src/plugins/TACTIC/vfx</w:t>
-      </w:r>
-      <w:r>
-        <w:rPr/>
-        <w:t>. The installer:</w:t>
+        <w:t>src/plugins/TACTIC/&lt;plugin&gt;</w:t>
+      </w:r>
+      <w:r>
+        <w:rPr/>
+        <w:t xml:space="preserve">, where the plugin is </w:t>
+      </w:r>
+      <w:r>
+        <w:rPr>
+          <w:rFonts w:eastAsia="Consolas" w:cs="Consolas" w:ascii="Consolas" w:hAnsi="Consolas"/>
+          <w:sz w:val="20"/>
+          <w:szCs w:val="20"/>
+          <w:shd w:fill="F2F2F2" w:val="clear"/>
+        </w:rPr>
+        <w:t>mlw</w:t>
+      </w:r>
+      <w:r>
+        <w:rPr/>
+        <w:t xml:space="preserve"> unless </w:t>
+      </w:r>
+      <w:r>
+        <w:rPr>
+          <w:rFonts w:eastAsia="Consolas" w:cs="Consolas" w:ascii="Consolas" w:hAnsi="Consolas"/>
+          <w:sz w:val="20"/>
+          <w:szCs w:val="20"/>
+          <w:shd w:fill="F2F2F2" w:val="clear"/>
+        </w:rPr>
+        <w:t>TACTIC_PLUGIN</w:t>
+      </w:r>
+      <w:r>
+        <w:rPr/>
+        <w:t xml:space="preserve"> says otherwise. The </w:t>
+      </w:r>
+      <w:r>
+        <w:rPr>
+          <w:rFonts w:eastAsia="Consolas" w:cs="Consolas" w:ascii="Consolas" w:hAnsi="Consolas"/>
+          <w:sz w:val="20"/>
+          <w:szCs w:val="20"/>
+          <w:shd w:fill="F2F2F2" w:val="clear"/>
+        </w:rPr>
+        <w:t>mlw</w:t>
+      </w:r>
+      <w:r>
+        <w:rPr/>
+        <w:t xml:space="preserve"> plugin comes from the </w:t>
+      </w:r>
+      <w:r>
+        <w:rPr>
+          <w:rFonts w:eastAsia="Consolas" w:cs="Consolas" w:ascii="Consolas" w:hAnsi="Consolas"/>
+          <w:sz w:val="20"/>
+          <w:szCs w:val="20"/>
+          <w:shd w:fill="F2F2F2" w:val="clear"/>
+        </w:rPr>
+        <w:t>magiclantern</w:t>
+      </w:r>
+      <w:r>
+        <w:rPr/>
+        <w:t xml:space="preserve"> branch of the TACTIC repository. It is TACTIC's VFX template under the </w:t>
+      </w:r>
+      <w:r>
+        <w:rPr>
+          <w:rFonts w:eastAsia="Consolas" w:cs="Consolas" w:ascii="Consolas" w:hAnsi="Consolas"/>
+          <w:sz w:val="20"/>
+          <w:szCs w:val="20"/>
+          <w:shd w:fill="F2F2F2" w:val="clear"/>
+        </w:rPr>
+        <w:t>mlw/</w:t>
+      </w:r>
+      <w:r>
+        <w:rPr/>
+        <w:t xml:space="preserve"> namespace: with </w:t>
+      </w:r>
+      <w:r>
+        <w:rPr>
+          <w:rFonts w:eastAsia="Consolas" w:cs="Consolas" w:ascii="Consolas" w:hAnsi="Consolas"/>
+          <w:sz w:val="20"/>
+          <w:szCs w:val="20"/>
+          <w:shd w:fill="F2F2F2" w:val="clear"/>
+        </w:rPr>
+        <w:t>vfx</w:t>
+      </w:r>
+      <w:r>
+        <w:rPr/>
+        <w:t xml:space="preserve"> replaced by </w:t>
+      </w:r>
+      <w:r>
+        <w:rPr>
+          <w:rFonts w:eastAsia="Consolas" w:cs="Consolas" w:ascii="Consolas" w:hAnsi="Consolas"/>
+          <w:sz w:val="20"/>
+          <w:szCs w:val="20"/>
+          <w:shd w:fill="F2F2F2" w:val="clear"/>
+        </w:rPr>
+        <w:t>mlw</w:t>
+      </w:r>
+      <w:r>
+        <w:rPr/>
+        <w:t xml:space="preserve">, the two plugin directories are identical, so </w:t>
+      </w:r>
+      <w:r>
+        <w:rPr>
+          <w:rFonts w:eastAsia="Consolas" w:cs="Consolas" w:ascii="Consolas" w:hAnsi="Consolas"/>
+          <w:sz w:val="20"/>
+          <w:szCs w:val="20"/>
+          <w:shd w:fill="F2F2F2" w:val="clear"/>
+        </w:rPr>
+        <w:t>TACTIC_PLUGIN=vfx</w:t>
+      </w:r>
+      <w:r>
+        <w:rPr/>
+        <w:t xml:space="preserve"> gives the same project under </w:t>
+      </w:r>
+      <w:r>
+        <w:rPr>
+          <w:rFonts w:eastAsia="Consolas" w:cs="Consolas" w:ascii="Consolas" w:hAnsi="Consolas"/>
+          <w:sz w:val="20"/>
+          <w:szCs w:val="20"/>
+          <w:shd w:fill="F2F2F2" w:val="clear"/>
+        </w:rPr>
+        <w:t>vfx</w:t>
+      </w:r>
+      <w:r>
+        <w:rPr/>
+        <w:t xml:space="preserve"> names. The installer:</w:t>
       </w:r>
     </w:p>
     <w:p>
@@ -2718,7 +2887,7 @@
           <w:szCs w:val="20"/>
           <w:shd w:fill="F2F2F2" w:val="clear"/>
         </w:rPr>
-        <w:t>vfx</w:t>
+        <w:t>mlw</w:t>
       </w:r>
       <w:r>
         <w:rPr/>
@@ -2737,16 +2906,16 @@
       </w:pPr>
       <w:r>
         <w:rPr/>
-        <w:t xml:space="preserve">registers the VFX search types, 23 in the </w:t>
-      </w:r>
-      <w:r>
-        <w:rPr>
-          <w:rFonts w:eastAsia="Consolas" w:cs="Consolas" w:ascii="Consolas" w:hAnsi="Consolas"/>
-          <w:sz w:val="20"/>
-          <w:szCs w:val="20"/>
-          <w:shd w:fill="F2F2F2" w:val="clear"/>
-        </w:rPr>
-        <w:t>vfx/</w:t>
+        <w:t xml:space="preserve">registers the plugin's search types, 23 in the </w:t>
+      </w:r>
+      <w:r>
+        <w:rPr>
+          <w:rFonts w:eastAsia="Consolas" w:cs="Consolas" w:ascii="Consolas" w:hAnsi="Consolas"/>
+          <w:sz w:val="20"/>
+          <w:szCs w:val="20"/>
+          <w:shd w:fill="F2F2F2" w:val="clear"/>
+        </w:rPr>
+        <w:t>mlw/</w:t>
       </w:r>
       <w:r>
         <w:rPr/>
@@ -2759,7 +2928,7 @@
           <w:szCs w:val="20"/>
           <w:shd w:fill="F2F2F2" w:val="clear"/>
         </w:rPr>
-        <w:t>vfx/shot</w:t>
+        <w:t>mlw/shot</w:t>
       </w:r>
       <w:r>
         <w:rPr/>
@@ -2772,7 +2941,7 @@
           <w:szCs w:val="20"/>
           <w:shd w:fill="F2F2F2" w:val="clear"/>
         </w:rPr>
-        <w:t>vfx/asset</w:t>
+        <w:t>mlw/asset</w:t>
       </w:r>
       <w:r>
         <w:rPr/>
@@ -2785,7 +2954,7 @@
           <w:szCs w:val="20"/>
           <w:shd w:fill="F2F2F2" w:val="clear"/>
         </w:rPr>
-        <w:t>vfx/sequence</w:t>
+        <w:t>mlw/sequence</w:t>
       </w:r>
       <w:r>
         <w:rPr/>
@@ -2798,7 +2967,7 @@
           <w:szCs w:val="20"/>
           <w:shd w:fill="F2F2F2" w:val="clear"/>
         </w:rPr>
-        <w:t>vfx/plate</w:t>
+        <w:t>mlw/plate</w:t>
       </w:r>
       <w:r>
         <w:rPr/>
@@ -2811,7 +2980,7 @@
           <w:szCs w:val="20"/>
           <w:shd w:fill="F2F2F2" w:val="clear"/>
         </w:rPr>
-        <w:t>vfx/review</w:t>
+        <w:t>mlw/review</w:t>
       </w:r>
       <w:r>
         <w:rPr/>
@@ -2865,7 +3034,7 @@
           <w:szCs w:val="20"/>
           <w:shd w:fill="F2F2F2" w:val="clear"/>
         </w:rPr>
-        <w:t>VFX_PROJECT_CODE</w:t>
+        <w:t>TACTIC_PROJECT_CODE</w:t>
       </w:r>
       <w:r>
         <w:rPr/>
@@ -2878,20 +3047,20 @@
           <w:szCs w:val="20"/>
           <w:shd w:fill="F2F2F2" w:val="clear"/>
         </w:rPr>
-        <w:t>VFX_PROJECT_TITLE</w:t>
-      </w:r>
-      <w:r>
-        <w:rPr/>
-        <w:t xml:space="preserve"> set the code and title; </w:t>
-      </w:r>
-      <w:r>
-        <w:rPr>
-          <w:rFonts w:eastAsia="Consolas" w:cs="Consolas" w:ascii="Consolas" w:hAnsi="Consolas"/>
-          <w:sz w:val="20"/>
-          <w:szCs w:val="20"/>
-          <w:shd w:fill="F2F2F2" w:val="clear"/>
-        </w:rPr>
-        <w:t>VFX_ENABLED=false</w:t>
+        <w:t>TACTIC_PROJECT_TITLE</w:t>
+      </w:r>
+      <w:r>
+        <w:rPr/>
+        <w:t xml:space="preserve"> set the code and title (they default to the plugin name); </w:t>
+      </w:r>
+      <w:r>
+        <w:rPr>
+          <w:rFonts w:eastAsia="Consolas" w:cs="Consolas" w:ascii="Consolas" w:hAnsi="Consolas"/>
+          <w:sz w:val="20"/>
+          <w:szCs w:val="20"/>
+          <w:shd w:fill="F2F2F2" w:val="clear"/>
+        </w:rPr>
+        <w:t>TACTIC_PROJECT_ENABLED=false</w:t>
       </w:r>
       <w:r>
         <w:rPr/>
@@ -2927,7 +3096,7 @@
         <w:pStyle w:val="Heading2"/>
         <w:rPr/>
       </w:pPr>
-      <w:bookmarkStart w:id="9" w:name="__RefHeading___Toc562_1750870680"/>
+      <w:bookmarkStart w:id="9" w:name="__RefHeading___Toc590_2820361070"/>
       <w:bookmarkEnd w:id="9"/>
       <w:r>
         <w:rPr/>
@@ -3029,7 +3198,7 @@
           <w:szCs w:val="20"/>
           <w:shd w:fill="F2F2F2" w:val="clear"/>
         </w:rPr>
-        <w:t>vfx</w:t>
+        <w:t>mlw</w:t>
       </w:r>
       <w:r>
         <w:rPr/>
@@ -3080,7 +3249,7 @@
         <w:pStyle w:val="Heading2"/>
         <w:rPr/>
       </w:pPr>
-      <w:bookmarkStart w:id="10" w:name="__RefHeading___Toc564_1750870680"/>
+      <w:bookmarkStart w:id="10" w:name="__RefHeading___Toc592_2820361070"/>
       <w:bookmarkEnd w:id="10"/>
       <w:r>
         <w:rPr/>
@@ -3661,7 +3830,7 @@
         <w:pStyle w:val="Heading2"/>
         <w:rPr/>
       </w:pPr>
-      <w:bookmarkStart w:id="11" w:name="__RefHeading___Toc566_1750870680"/>
+      <w:bookmarkStart w:id="11" w:name="__RefHeading___Toc594_2820361070"/>
       <w:bookmarkEnd w:id="11"/>
       <w:r>
         <w:rPr/>
@@ -4192,7 +4361,7 @@
                 <w:szCs w:val="20"/>
                 <w:shd w:fill="F2F2F2" w:val="clear"/>
               </w:rPr>
-              <w:t>VFX_ENABLED</w:t>
+              <w:t>TACTIC_PROJECT_ENABLED</w:t>
             </w:r>
             <w:r>
               <w:rPr>
@@ -4208,7 +4377,7 @@
                 <w:szCs w:val="20"/>
                 <w:shd w:fill="F2F2F2" w:val="clear"/>
               </w:rPr>
-              <w:t>VFX_PROJECT_CODE</w:t>
+              <w:t>TACTIC_PLUGIN</w:t>
             </w:r>
             <w:r>
               <w:rPr>
@@ -4224,7 +4393,23 @@
                 <w:szCs w:val="20"/>
                 <w:shd w:fill="F2F2F2" w:val="clear"/>
               </w:rPr>
-              <w:t>VFX_PROJECT_TITLE</w:t>
+              <w:t>TACTIC_PROJECT_CODE</w:t>
+            </w:r>
+            <w:r>
+              <w:rPr>
+                <w:sz w:val="20"/>
+                <w:szCs w:val="20"/>
+              </w:rPr>
+              <w:t xml:space="preserve">, </w:t>
+            </w:r>
+            <w:r>
+              <w:rPr>
+                <w:rFonts w:eastAsia="Consolas" w:cs="Consolas" w:ascii="Consolas" w:hAnsi="Consolas"/>
+                <w:sz w:val="20"/>
+                <w:szCs w:val="20"/>
+                <w:shd w:fill="F2F2F2" w:val="clear"/>
+              </w:rPr>
+              <w:t>TACTIC_PROJECT_TITLE</w:t>
             </w:r>
           </w:p>
         </w:tc>
@@ -4248,7 +4433,7 @@
                 <w:sz w:val="20"/>
                 <w:szCs w:val="20"/>
               </w:rPr>
-              <w:t xml:space="preserve">First-start VFX project (read by </w:t>
+              <w:t xml:space="preserve">First-start project (read by </w:t>
             </w:r>
             <w:r>
               <w:rPr>
@@ -4257,7 +4442,7 @@
                 <w:szCs w:val="20"/>
                 <w:shd w:fill="F2F2F2" w:val="clear"/>
               </w:rPr>
-              <w:t>bootstrap_vfx.py</w:t>
+              <w:t>bootstrap_project.py</w:t>
             </w:r>
             <w:r>
               <w:rPr>
@@ -4377,7 +4562,7 @@
         <w:pStyle w:val="Heading2"/>
         <w:rPr/>
       </w:pPr>
-      <w:bookmarkStart w:id="12" w:name="__RefHeading___Toc568_1750870680"/>
+      <w:bookmarkStart w:id="12" w:name="__RefHeading___Toc596_2820361070"/>
       <w:bookmarkEnd w:id="12"/>
       <w:r>
         <w:rPr/>
@@ -4564,7 +4749,7 @@
         <w:pStyle w:val="Heading2"/>
         <w:rPr/>
       </w:pPr>
-      <w:bookmarkStart w:id="13" w:name="__RefHeading___Toc570_1750870680"/>
+      <w:bookmarkStart w:id="13" w:name="__RefHeading___Toc598_2820361070"/>
       <w:bookmarkEnd w:id="13"/>
       <w:r>
         <w:rPr/>
@@ -4804,7 +4989,7 @@
           <w:szCs w:val="20"/>
           <w:shd w:fill="F2F2F2" w:val="clear"/>
         </w:rPr>
-        <w:t>vfx</w:t>
+        <w:t>mlw</w:t>
       </w:r>
       <w:r>
         <w:rPr/>
@@ -4842,7 +5027,7 @@
         <w:pStyle w:val="Heading2"/>
         <w:rPr/>
       </w:pPr>
-      <w:bookmarkStart w:id="14" w:name="__RefHeading___Toc572_1750870680"/>
+      <w:bookmarkStart w:id="14" w:name="__RefHeading___Toc600_2820361070"/>
       <w:bookmarkEnd w:id="14"/>
       <w:r>
         <w:rPr/>
@@ -4891,7 +5076,7 @@
       </w:pPr>
       <w:r>
         <w:rPr/>
-        <w:t>EXR frames get no thumbnails or web renditions (see the VFX project section).</w:t>
+        <w:t>EXR frames get no thumbnails or web renditions (see the MLW project section).</w:t>
       </w:r>
     </w:p>
     <w:p>
@@ -4906,16 +5091,16 @@
       </w:pPr>
       <w:r>
         <w:rPr/>
-        <w:t xml:space="preserve">If the VFX install fails part way, the project record can already exist. The next start then skips the install and leaves the project incomplete. Remove the project and its </w:t>
-      </w:r>
-      <w:r>
-        <w:rPr>
-          <w:rFonts w:eastAsia="Consolas" w:cs="Consolas" w:ascii="Consolas" w:hAnsi="Consolas"/>
-          <w:sz w:val="20"/>
-          <w:szCs w:val="20"/>
-          <w:shd w:fill="F2F2F2" w:val="clear"/>
-        </w:rPr>
-        <w:t>vfx</w:t>
+        <w:t xml:space="preserve">If the project install fails part way, the project record can already exist. The next start then skips the install and leaves the project incomplete. Remove the project and its </w:t>
+      </w:r>
+      <w:r>
+        <w:rPr>
+          <w:rFonts w:eastAsia="Consolas" w:cs="Consolas" w:ascii="Consolas" w:hAnsi="Consolas"/>
+          <w:sz w:val="20"/>
+          <w:szCs w:val="20"/>
+          <w:shd w:fill="F2F2F2" w:val="clear"/>
+        </w:rPr>
+        <w:t>mlw</w:t>
       </w:r>
       <w:r>
         <w:rPr/>
@@ -4956,7 +5141,7 @@
           <w:szCs w:val="20"/>
           <w:shd w:fill="F2F2F2" w:val="clear"/>
         </w:rPr>
-        <w:t>5.0</w:t>
+        <w:t>magiclantern</w:t>
       </w:r>
       <w:r>
         <w:rPr/>

</xml_diff>